<commit_message>
segundo commit del proyecto
</commit_message>
<xml_diff>
--- a/Glosario django.docx
+++ b/Glosario django.docx
@@ -391,14 +391,16 @@
             <w:pPr>
               <w:rPr>
                 <w:rFonts w:ascii="Times New Roman" w:eastAsia="Times New Roman" w:hAnsi="Times New Roman" w:cs="Times New Roman"/>
-                <w:sz w:val="24"/>
-                <w:szCs w:val="24"/>
-              </w:rPr>
-            </w:pPr>
-            <w:proofErr w:type="spellStart"/>
-            <w:r>
-              <w:rPr>
-                <w:rFonts w:ascii="Courier New" w:eastAsia="Times New Roman" w:hAnsi="Courier New" w:cs="Courier New"/>
+                <w:color w:val="FF0000"/>
+                <w:sz w:val="24"/>
+                <w:szCs w:val="24"/>
+              </w:rPr>
+            </w:pPr>
+            <w:proofErr w:type="spellStart"/>
+            <w:r>
+              <w:rPr>
+                <w:rFonts w:ascii="Courier New" w:eastAsia="Times New Roman" w:hAnsi="Courier New" w:cs="Courier New"/>
+                <w:color w:val="FF0000"/>
                 <w:sz w:val="20"/>
                 <w:szCs w:val="20"/>
               </w:rPr>
@@ -417,14 +419,16 @@
               <w:cnfStyle w:val="000000100000" w:firstRow="0" w:lastRow="0" w:firstColumn="0" w:lastColumn="0" w:oddVBand="0" w:evenVBand="0" w:oddHBand="1" w:evenHBand="0" w:firstRowFirstColumn="0" w:firstRowLastColumn="0" w:lastRowFirstColumn="0" w:lastRowLastColumn="0"/>
               <w:rPr>
                 <w:rFonts w:ascii="Times New Roman" w:eastAsia="Times New Roman" w:hAnsi="Times New Roman" w:cs="Times New Roman"/>
-                <w:sz w:val="24"/>
-                <w:szCs w:val="24"/>
-                <w:lang w:val="es-AR"/>
-              </w:rPr>
-            </w:pPr>
-            <w:r>
-              <w:rPr>
-                <w:rFonts w:ascii="Times New Roman" w:eastAsia="Times New Roman" w:hAnsi="Times New Roman" w:cs="Times New Roman"/>
+                <w:color w:val="FF0000"/>
+                <w:sz w:val="24"/>
+                <w:szCs w:val="24"/>
+                <w:lang w:val="es-AR"/>
+              </w:rPr>
+            </w:pPr>
+            <w:r>
+              <w:rPr>
+                <w:rFonts w:ascii="Times New Roman" w:eastAsia="Times New Roman" w:hAnsi="Times New Roman" w:cs="Times New Roman"/>
+                <w:color w:val="FF0000"/>
                 <w:sz w:val="24"/>
                 <w:szCs w:val="24"/>
                 <w:lang w:val="es-AR"/>
@@ -443,14 +447,16 @@
               <w:cnfStyle w:val="000000100000" w:firstRow="0" w:lastRow="0" w:firstColumn="0" w:lastColumn="0" w:oddVBand="0" w:evenVBand="0" w:oddHBand="1" w:evenHBand="0" w:firstRowFirstColumn="0" w:firstRowLastColumn="0" w:lastRowFirstColumn="0" w:lastRowLastColumn="0"/>
               <w:rPr>
                 <w:rFonts w:ascii="Times New Roman" w:eastAsia="Times New Roman" w:hAnsi="Times New Roman" w:cs="Times New Roman"/>
-                <w:sz w:val="24"/>
-                <w:szCs w:val="24"/>
-              </w:rPr>
-            </w:pPr>
-            <w:proofErr w:type="spellStart"/>
-            <w:r>
-              <w:rPr>
-                <w:rFonts w:ascii="Times New Roman" w:eastAsia="Times New Roman" w:hAnsi="Times New Roman" w:cs="Times New Roman"/>
+                <w:color w:val="FF0000"/>
+                <w:sz w:val="24"/>
+                <w:szCs w:val="24"/>
+              </w:rPr>
+            </w:pPr>
+            <w:proofErr w:type="spellStart"/>
+            <w:r>
+              <w:rPr>
+                <w:rFonts w:ascii="Times New Roman" w:eastAsia="Times New Roman" w:hAnsi="Times New Roman" w:cs="Times New Roman"/>
+                <w:color w:val="FF0000"/>
                 <w:sz w:val="24"/>
                 <w:szCs w:val="24"/>
               </w:rPr>
@@ -460,6 +466,7 @@
             <w:r>
               <w:rPr>
                 <w:rFonts w:ascii="Times New Roman" w:eastAsia="Times New Roman" w:hAnsi="Times New Roman" w:cs="Times New Roman"/>
+                <w:color w:val="FF0000"/>
                 <w:sz w:val="24"/>
                 <w:szCs w:val="24"/>
               </w:rPr>
@@ -477,13 +484,15 @@
               <w:cnfStyle w:val="000000100000" w:firstRow="0" w:lastRow="0" w:firstColumn="0" w:lastColumn="0" w:oddVBand="0" w:evenVBand="0" w:oddHBand="1" w:evenHBand="0" w:firstRowFirstColumn="0" w:firstRowLastColumn="0" w:lastRowFirstColumn="0" w:lastRowLastColumn="0"/>
               <w:rPr>
                 <w:rFonts w:ascii="Times New Roman" w:eastAsia="Times New Roman" w:hAnsi="Times New Roman" w:cs="Times New Roman"/>
-                <w:sz w:val="24"/>
-                <w:szCs w:val="24"/>
-              </w:rPr>
-            </w:pPr>
-            <w:r>
-              <w:rPr>
-                <w:rFonts w:ascii="Courier New" w:eastAsia="Times New Roman" w:hAnsi="Courier New" w:cs="Courier New"/>
+                <w:color w:val="FF0000"/>
+                <w:sz w:val="24"/>
+                <w:szCs w:val="24"/>
+              </w:rPr>
+            </w:pPr>
+            <w:r>
+              <w:rPr>
+                <w:rFonts w:ascii="Courier New" w:eastAsia="Times New Roman" w:hAnsi="Courier New" w:cs="Courier New"/>
+                <w:color w:val="FF0000"/>
                 <w:sz w:val="20"/>
                 <w:szCs w:val="20"/>
               </w:rPr>
@@ -493,6 +502,7 @@
             <w:r>
               <w:rPr>
                 <w:rFonts w:ascii="Courier New" w:eastAsia="Times New Roman" w:hAnsi="Courier New" w:cs="Courier New"/>
+                <w:color w:val="FF0000"/>
                 <w:sz w:val="20"/>
                 <w:szCs w:val="20"/>
               </w:rPr>
@@ -502,6 +512,7 @@
             <w:r>
               <w:rPr>
                 <w:rFonts w:ascii="Courier New" w:eastAsia="Times New Roman" w:hAnsi="Courier New" w:cs="Courier New"/>
+                <w:color w:val="FF0000"/>
                 <w:sz w:val="20"/>
                 <w:szCs w:val="20"/>
               </w:rPr>
@@ -511,6 +522,7 @@
             <w:r>
               <w:rPr>
                 <w:rFonts w:ascii="Courier New" w:eastAsia="Times New Roman" w:hAnsi="Courier New" w:cs="Courier New"/>
+                <w:color w:val="FF0000"/>
                 <w:sz w:val="20"/>
                 <w:szCs w:val="20"/>
               </w:rPr>
@@ -529,18 +541,31 @@
           <w:p>
             <w:pPr>
               <w:rPr>
-                <w:rFonts w:ascii="Courier New" w:eastAsia="Times New Roman" w:hAnsi="Courier New" w:cs="Courier New"/>
-                <w:sz w:val="20"/>
-                <w:szCs w:val="20"/>
-              </w:rPr>
-            </w:pPr>
-            <w:r>
-              <w:rPr>
-                <w:rFonts w:ascii="Courier New" w:eastAsia="Times New Roman" w:hAnsi="Courier New" w:cs="Courier New"/>
-                <w:sz w:val="20"/>
-                <w:szCs w:val="20"/>
-              </w:rPr>
-              <w:t>request</w:t>
+                <w:rFonts w:ascii="Times New Roman" w:eastAsia="Times New Roman" w:hAnsi="Times New Roman" w:cs="Times New Roman"/>
+                <w:color w:val="FF0000"/>
+                <w:sz w:val="24"/>
+                <w:szCs w:val="24"/>
+              </w:rPr>
+            </w:pPr>
+            <w:proofErr w:type="spellStart"/>
+            <w:r>
+              <w:rPr>
+                <w:rFonts w:ascii="Courier New" w:eastAsia="Times New Roman" w:hAnsi="Courier New" w:cs="Courier New"/>
+                <w:color w:val="FF0000"/>
+                <w:sz w:val="20"/>
+                <w:szCs w:val="20"/>
+              </w:rPr>
+              <w:t>HttpResponse</w:t>
+            </w:r>
+            <w:proofErr w:type="spellEnd"/>
+            <w:r>
+              <w:rPr>
+                <w:rFonts w:ascii="Courier New" w:eastAsia="Times New Roman" w:hAnsi="Courier New" w:cs="Courier New"/>
+                <w:color w:val="FF0000"/>
+                <w:sz w:val="20"/>
+                <w:szCs w:val="20"/>
+              </w:rPr>
+              <w:t>()</w:t>
             </w:r>
           </w:p>
         </w:tc>
@@ -553,30 +578,21 @@
               <w:cnfStyle w:val="000000000000" w:firstRow="0" w:lastRow="0" w:firstColumn="0" w:lastColumn="0" w:oddVBand="0" w:evenVBand="0" w:oddHBand="0" w:evenHBand="0" w:firstRowFirstColumn="0" w:firstRowLastColumn="0" w:lastRowFirstColumn="0" w:lastRowLastColumn="0"/>
               <w:rPr>
                 <w:rFonts w:ascii="Times New Roman" w:eastAsia="Times New Roman" w:hAnsi="Times New Roman" w:cs="Times New Roman"/>
-                <w:sz w:val="24"/>
-                <w:szCs w:val="24"/>
-                <w:lang w:val="es-AR"/>
-              </w:rPr>
-            </w:pPr>
-            <w:r>
-              <w:rPr>
-                <w:lang w:val="es-AR"/>
-              </w:rPr>
-              <w:t>Django recibe una solicitud del navegador (una “</w:t>
-            </w:r>
-            <w:proofErr w:type="spellStart"/>
-            <w:r>
-              <w:rPr>
-                <w:lang w:val="es-AR"/>
-              </w:rPr>
-              <w:t>request</w:t>
-            </w:r>
-            <w:proofErr w:type="spellEnd"/>
-            <w:r>
-              <w:rPr>
-                <w:lang w:val="es-AR"/>
-              </w:rPr>
-              <w:t>”) y te la entrega como un objeto que contiene toda la información de esa visita.</w:t>
+                <w:color w:val="FF0000"/>
+                <w:sz w:val="24"/>
+                <w:szCs w:val="24"/>
+                <w:lang w:val="es-AR"/>
+              </w:rPr>
+            </w:pPr>
+            <w:r>
+              <w:rPr>
+                <w:rFonts w:ascii="Times New Roman" w:eastAsia="Times New Roman" w:hAnsi="Times New Roman" w:cs="Times New Roman"/>
+                <w:color w:val="FF0000"/>
+                <w:sz w:val="24"/>
+                <w:szCs w:val="24"/>
+                <w:lang w:val="es-AR"/>
+              </w:rPr>
+              <w:t>Función que devuelve texto simple como respuesta HTTP</w:t>
             </w:r>
           </w:p>
         </w:tc>
@@ -588,112 +604,178 @@
             <w:pPr>
               <w:cnfStyle w:val="000000000000" w:firstRow="0" w:lastRow="0" w:firstColumn="0" w:lastColumn="0" w:oddVBand="0" w:evenVBand="0" w:oddHBand="0" w:evenHBand="0" w:firstRowFirstColumn="0" w:firstRowLastColumn="0" w:lastRowFirstColumn="0" w:lastRowLastColumn="0"/>
               <w:rPr>
-                <w:rFonts w:ascii="Times New Roman" w:eastAsia="Times New Roman" w:hAnsi="Times New Roman" w:cs="Times New Roman"/>
-                <w:sz w:val="24"/>
-                <w:szCs w:val="24"/>
-                <w:lang w:val="es-AR"/>
-              </w:rPr>
-            </w:pPr>
-            <w:r>
-              <w:rPr>
-                <w:lang w:val="es-AR"/>
-              </w:rPr>
-              <w:t xml:space="preserve">Siempre aparece como </w:t>
-            </w:r>
-            <w:r>
-              <w:rPr>
-                <w:rStyle w:val="Textoennegrita"/>
-                <w:lang w:val="es-AR"/>
-              </w:rPr>
-              <w:t>parámetro en una vista</w:t>
-            </w:r>
-          </w:p>
-        </w:tc>
-        <w:tc>
-          <w:tcPr>
-            <w:tcW w:w="0" w:type="auto"/>
-          </w:tcPr>
+                <w:rFonts w:ascii="Courier New" w:eastAsia="Times New Roman" w:hAnsi="Courier New" w:cs="Courier New"/>
+                <w:color w:val="FF0000"/>
+                <w:sz w:val="20"/>
+                <w:szCs w:val="20"/>
+              </w:rPr>
+            </w:pPr>
+            <w:proofErr w:type="spellStart"/>
+            <w:r>
+              <w:rPr>
+                <w:rFonts w:ascii="Times New Roman" w:eastAsia="Times New Roman" w:hAnsi="Times New Roman" w:cs="Times New Roman"/>
+                <w:color w:val="FF0000"/>
+                <w:sz w:val="24"/>
+                <w:szCs w:val="24"/>
+              </w:rPr>
+              <w:t>En</w:t>
+            </w:r>
+            <w:proofErr w:type="spellEnd"/>
+            <w:r>
+              <w:rPr>
+                <w:rFonts w:ascii="Times New Roman" w:eastAsia="Times New Roman" w:hAnsi="Times New Roman" w:cs="Times New Roman"/>
+                <w:color w:val="FF0000"/>
+                <w:sz w:val="24"/>
+                <w:szCs w:val="24"/>
+              </w:rPr>
+              <w:t xml:space="preserve"> </w:t>
+            </w:r>
+            <w:r>
+              <w:rPr>
+                <w:rFonts w:ascii="Courier New" w:eastAsia="Times New Roman" w:hAnsi="Courier New" w:cs="Courier New"/>
+                <w:color w:val="FF0000"/>
+                <w:sz w:val="20"/>
+                <w:szCs w:val="20"/>
+              </w:rPr>
+              <w:t>views.py</w:t>
+            </w:r>
+          </w:p>
           <w:p>
             <w:pPr>
               <w:cnfStyle w:val="000000000000" w:firstRow="0" w:lastRow="0" w:firstColumn="0" w:lastColumn="0" w:oddVBand="0" w:evenVBand="0" w:oddHBand="0" w:evenHBand="0" w:firstRowFirstColumn="0" w:firstRowLastColumn="0" w:lastRowFirstColumn="0" w:lastRowLastColumn="0"/>
               <w:rPr>
                 <w:rFonts w:ascii="Courier New" w:eastAsia="Times New Roman" w:hAnsi="Courier New" w:cs="Courier New"/>
-                <w:sz w:val="20"/>
-                <w:szCs w:val="20"/>
-              </w:rPr>
-            </w:pPr>
-            <w:r>
-              <w:rPr>
-                <w:rFonts w:ascii="Courier New" w:eastAsia="Times New Roman" w:hAnsi="Courier New" w:cs="Courier New"/>
-                <w:sz w:val="20"/>
-                <w:szCs w:val="20"/>
-              </w:rPr>
-              <w:t>from django.http import HttpResponse</w:t>
-            </w:r>
+                <w:color w:val="FF0000"/>
+                <w:sz w:val="20"/>
+                <w:szCs w:val="20"/>
+              </w:rPr>
+            </w:pPr>
           </w:p>
           <w:p>
             <w:pPr>
               <w:cnfStyle w:val="000000000000" w:firstRow="0" w:lastRow="0" w:firstColumn="0" w:lastColumn="0" w:oddVBand="0" w:evenVBand="0" w:oddHBand="0" w:evenHBand="0" w:firstRowFirstColumn="0" w:firstRowLastColumn="0" w:lastRowFirstColumn="0" w:lastRowLastColumn="0"/>
               <w:rPr>
                 <w:rFonts w:ascii="Courier New" w:eastAsia="Times New Roman" w:hAnsi="Courier New" w:cs="Courier New"/>
-                <w:sz w:val="20"/>
-                <w:szCs w:val="20"/>
-              </w:rPr>
-            </w:pPr>
+                <w:color w:val="FF0000"/>
+                <w:sz w:val="20"/>
+                <w:szCs w:val="20"/>
+              </w:rPr>
+            </w:pPr>
+            <w:r>
+              <w:rPr>
+                <w:rFonts w:ascii="Courier New" w:eastAsia="Times New Roman" w:hAnsi="Courier New" w:cs="Courier New"/>
+                <w:color w:val="FF0000"/>
+                <w:sz w:val="20"/>
+                <w:szCs w:val="20"/>
+              </w:rPr>
+              <w:t xml:space="preserve">from </w:t>
+            </w:r>
+            <w:proofErr w:type="spellStart"/>
+            <w:proofErr w:type="gramStart"/>
+            <w:r>
+              <w:rPr>
+                <w:rFonts w:ascii="Courier New" w:eastAsia="Times New Roman" w:hAnsi="Courier New" w:cs="Courier New"/>
+                <w:color w:val="FF0000"/>
+                <w:sz w:val="20"/>
+                <w:szCs w:val="20"/>
+              </w:rPr>
+              <w:t>django.http</w:t>
+            </w:r>
+            <w:proofErr w:type="spellEnd"/>
+            <w:proofErr w:type="gramEnd"/>
+            <w:r>
+              <w:rPr>
+                <w:rFonts w:ascii="Courier New" w:eastAsia="Times New Roman" w:hAnsi="Courier New" w:cs="Courier New"/>
+                <w:color w:val="FF0000"/>
+                <w:sz w:val="20"/>
+                <w:szCs w:val="20"/>
+              </w:rPr>
+              <w:t xml:space="preserve"> import </w:t>
+            </w:r>
+            <w:proofErr w:type="spellStart"/>
+            <w:r>
+              <w:rPr>
+                <w:rFonts w:ascii="Courier New" w:eastAsia="Times New Roman" w:hAnsi="Courier New" w:cs="Courier New"/>
+                <w:color w:val="FF0000"/>
+                <w:sz w:val="20"/>
+                <w:szCs w:val="20"/>
+              </w:rPr>
+              <w:t>HttpResponse</w:t>
+            </w:r>
+            <w:proofErr w:type="spellEnd"/>
           </w:p>
           <w:p>
             <w:pPr>
               <w:cnfStyle w:val="000000000000" w:firstRow="0" w:lastRow="0" w:firstColumn="0" w:lastColumn="0" w:oddVBand="0" w:evenVBand="0" w:oddHBand="0" w:evenHBand="0" w:firstRowFirstColumn="0" w:firstRowLastColumn="0" w:lastRowFirstColumn="0" w:lastRowLastColumn="0"/>
               <w:rPr>
-                <w:rFonts w:ascii="Courier New" w:eastAsia="Times New Roman" w:hAnsi="Courier New" w:cs="Courier New"/>
-                <w:sz w:val="20"/>
-                <w:szCs w:val="20"/>
-              </w:rPr>
-            </w:pPr>
-            <w:r>
-              <w:rPr>
-                <w:rFonts w:ascii="Courier New" w:eastAsia="Times New Roman" w:hAnsi="Courier New" w:cs="Courier New"/>
-                <w:sz w:val="20"/>
-                <w:szCs w:val="20"/>
-              </w:rPr>
-              <w:t>def index(request):</w:t>
-            </w:r>
-          </w:p>
+                <w:rFonts w:ascii="Times New Roman" w:eastAsia="Times New Roman" w:hAnsi="Times New Roman" w:cs="Times New Roman"/>
+                <w:color w:val="FF0000"/>
+                <w:sz w:val="24"/>
+                <w:szCs w:val="24"/>
+              </w:rPr>
+            </w:pPr>
+          </w:p>
+        </w:tc>
+        <w:tc>
+          <w:tcPr>
+            <w:tcW w:w="0" w:type="auto"/>
+          </w:tcPr>
           <w:p>
             <w:pPr>
               <w:cnfStyle w:val="000000000000" w:firstRow="0" w:lastRow="0" w:firstColumn="0" w:lastColumn="0" w:oddVBand="0" w:evenVBand="0" w:oddHBand="0" w:evenHBand="0" w:firstRowFirstColumn="0" w:firstRowLastColumn="0" w:lastRowFirstColumn="0" w:lastRowLastColumn="0"/>
               <w:rPr>
-                <w:rFonts w:ascii="Courier New" w:eastAsia="Times New Roman" w:hAnsi="Courier New" w:cs="Courier New"/>
-                <w:sz w:val="20"/>
-                <w:szCs w:val="20"/>
-                <w:lang w:val="es-AR"/>
-              </w:rPr>
-            </w:pPr>
-            <w:r>
-              <w:rPr>
-                <w:rFonts w:ascii="Courier New" w:eastAsia="Times New Roman" w:hAnsi="Courier New" w:cs="Courier New"/>
-                <w:sz w:val="20"/>
-                <w:szCs w:val="20"/>
-              </w:rPr>
-              <w:t xml:space="preserve">    </w:t>
-            </w:r>
-            <w:proofErr w:type="spellStart"/>
-            <w:r>
-              <w:rPr>
-                <w:rFonts w:ascii="Courier New" w:eastAsia="Times New Roman" w:hAnsi="Courier New" w:cs="Courier New"/>
-                <w:sz w:val="20"/>
-                <w:szCs w:val="20"/>
-                <w:lang w:val="es-AR"/>
-              </w:rPr>
-              <w:t>return</w:t>
-            </w:r>
-            <w:proofErr w:type="spellEnd"/>
-            <w:r>
-              <w:rPr>
-                <w:rFonts w:ascii="Courier New" w:eastAsia="Times New Roman" w:hAnsi="Courier New" w:cs="Courier New"/>
-                <w:sz w:val="20"/>
-                <w:szCs w:val="20"/>
-                <w:lang w:val="es-AR"/>
+                <w:rFonts w:ascii="Times New Roman" w:eastAsia="Times New Roman" w:hAnsi="Times New Roman" w:cs="Times New Roman"/>
+                <w:color w:val="FF0000"/>
+                <w:sz w:val="24"/>
+                <w:szCs w:val="24"/>
+              </w:rPr>
+            </w:pPr>
+            <w:r>
+              <w:rPr>
+                <w:rFonts w:ascii="Courier New" w:eastAsia="Times New Roman" w:hAnsi="Courier New" w:cs="Courier New"/>
+                <w:color w:val="FF0000"/>
+                <w:sz w:val="20"/>
+                <w:szCs w:val="20"/>
+              </w:rPr>
+              <w:t xml:space="preserve">return </w:t>
+            </w:r>
+            <w:proofErr w:type="spellStart"/>
+            <w:r>
+              <w:rPr>
+                <w:rFonts w:ascii="Courier New" w:eastAsia="Times New Roman" w:hAnsi="Courier New" w:cs="Courier New"/>
+                <w:color w:val="FF0000"/>
+                <w:sz w:val="20"/>
+                <w:szCs w:val="20"/>
+              </w:rPr>
+              <w:t>HttpResponse</w:t>
+            </w:r>
+            <w:proofErr w:type="spellEnd"/>
+            <w:r>
+              <w:rPr>
+                <w:rFonts w:ascii="Courier New" w:eastAsia="Times New Roman" w:hAnsi="Courier New" w:cs="Courier New"/>
+                <w:color w:val="FF0000"/>
+                <w:sz w:val="20"/>
+                <w:szCs w:val="20"/>
+              </w:rPr>
+              <w:t>("</w:t>
+            </w:r>
+            <w:proofErr w:type="spellStart"/>
+            <w:r>
+              <w:rPr>
+                <w:rFonts w:ascii="Courier New" w:eastAsia="Times New Roman" w:hAnsi="Courier New" w:cs="Courier New"/>
+                <w:color w:val="FF0000"/>
+                <w:sz w:val="20"/>
+                <w:szCs w:val="20"/>
+              </w:rPr>
+              <w:t>Hola</w:t>
+            </w:r>
+            <w:proofErr w:type="spellEnd"/>
+            <w:r>
+              <w:rPr>
+                <w:rFonts w:ascii="Courier New" w:eastAsia="Times New Roman" w:hAnsi="Courier New" w:cs="Courier New"/>
+                <w:color w:val="FF0000"/>
+                <w:sz w:val="20"/>
+                <w:szCs w:val="20"/>
               </w:rPr>
               <w:t xml:space="preserve"> </w:t>
             </w:r>
@@ -701,24 +783,22 @@
             <w:r>
               <w:rPr>
                 <w:rFonts w:ascii="Courier New" w:eastAsia="Times New Roman" w:hAnsi="Courier New" w:cs="Courier New"/>
-                <w:sz w:val="20"/>
-                <w:szCs w:val="20"/>
-                <w:lang w:val="es-AR"/>
-              </w:rPr>
-              <w:t>HttpResponse</w:t>
-            </w:r>
-            <w:proofErr w:type="spellEnd"/>
-            <w:r>
-              <w:rPr>
-                <w:rFonts w:ascii="Courier New" w:eastAsia="Times New Roman" w:hAnsi="Courier New" w:cs="Courier New"/>
-                <w:sz w:val="20"/>
-                <w:szCs w:val="20"/>
-                <w:lang w:val="es-AR"/>
-              </w:rPr>
-              <w:t>("Hola mundo")</w:t>
-            </w:r>
-            <w:bookmarkStart w:id="0" w:name="_GoBack"/>
-            <w:bookmarkEnd w:id="0"/>
+                <w:color w:val="FF0000"/>
+                <w:sz w:val="20"/>
+                <w:szCs w:val="20"/>
+              </w:rPr>
+              <w:t>mundo</w:t>
+            </w:r>
+            <w:proofErr w:type="spellEnd"/>
+            <w:r>
+              <w:rPr>
+                <w:rFonts w:ascii="Courier New" w:eastAsia="Times New Roman" w:hAnsi="Courier New" w:cs="Courier New"/>
+                <w:color w:val="FF0000"/>
+                <w:sz w:val="20"/>
+                <w:szCs w:val="20"/>
+              </w:rPr>
+              <w:t>")</w:t>
+            </w:r>
           </w:p>
         </w:tc>
       </w:tr>
@@ -730,142 +810,184 @@
           <w:tcPr>
             <w:cnfStyle w:val="001000000000" w:firstRow="0" w:lastRow="0" w:firstColumn="1" w:lastColumn="0" w:oddVBand="0" w:evenVBand="0" w:oddHBand="0" w:evenHBand="0" w:firstRowFirstColumn="0" w:firstRowLastColumn="0" w:lastRowFirstColumn="0" w:lastRowLastColumn="0"/>
             <w:tcW w:w="0" w:type="auto"/>
-            <w:hideMark/>
-          </w:tcPr>
-          <w:p>
-            <w:pPr>
-              <w:rPr>
-                <w:rFonts w:ascii="Times New Roman" w:eastAsia="Times New Roman" w:hAnsi="Times New Roman" w:cs="Times New Roman"/>
-                <w:sz w:val="24"/>
-                <w:szCs w:val="24"/>
-              </w:rPr>
-            </w:pPr>
-            <w:r>
-              <w:rPr>
-                <w:rFonts w:ascii="Courier New" w:eastAsia="Times New Roman" w:hAnsi="Courier New" w:cs="Courier New"/>
-                <w:sz w:val="20"/>
-                <w:szCs w:val="20"/>
-              </w:rPr>
-              <w:t>views.py</w:t>
-            </w:r>
-          </w:p>
-        </w:tc>
-        <w:tc>
-          <w:tcPr>
-            <w:tcW w:w="0" w:type="auto"/>
-            <w:hideMark/>
+          </w:tcPr>
+          <w:p>
+            <w:pPr>
+              <w:rPr>
+                <w:rFonts w:ascii="Courier New" w:eastAsia="Times New Roman" w:hAnsi="Courier New" w:cs="Courier New"/>
+                <w:color w:val="FF0000"/>
+                <w:sz w:val="20"/>
+                <w:szCs w:val="20"/>
+              </w:rPr>
+            </w:pPr>
+            <w:r>
+              <w:rPr>
+                <w:rFonts w:ascii="Courier New" w:eastAsia="Times New Roman" w:hAnsi="Courier New" w:cs="Courier New"/>
+                <w:color w:val="FF0000"/>
+                <w:sz w:val="20"/>
+                <w:szCs w:val="20"/>
+              </w:rPr>
+              <w:t>request</w:t>
+            </w:r>
+          </w:p>
+        </w:tc>
+        <w:tc>
+          <w:tcPr>
+            <w:tcW w:w="0" w:type="auto"/>
           </w:tcPr>
           <w:p>
             <w:pPr>
               <w:cnfStyle w:val="000000100000" w:firstRow="0" w:lastRow="0" w:firstColumn="0" w:lastColumn="0" w:oddVBand="0" w:evenVBand="0" w:oddHBand="1" w:evenHBand="0" w:firstRowFirstColumn="0" w:firstRowLastColumn="0" w:lastRowFirstColumn="0" w:lastRowLastColumn="0"/>
               <w:rPr>
                 <w:rFonts w:ascii="Times New Roman" w:eastAsia="Times New Roman" w:hAnsi="Times New Roman" w:cs="Times New Roman"/>
-                <w:sz w:val="24"/>
-                <w:szCs w:val="24"/>
-                <w:lang w:val="es-AR"/>
-              </w:rPr>
-            </w:pPr>
-            <w:r>
-              <w:rPr>
-                <w:rFonts w:ascii="Times New Roman" w:eastAsia="Times New Roman" w:hAnsi="Times New Roman" w:cs="Times New Roman"/>
-                <w:sz w:val="24"/>
-                <w:szCs w:val="24"/>
-                <w:lang w:val="es-AR"/>
-              </w:rPr>
-              <w:t>Archivo donde se definen funciones que responden a las peticiones HTTP</w:t>
-            </w:r>
-          </w:p>
-        </w:tc>
-        <w:tc>
-          <w:tcPr>
-            <w:tcW w:w="0" w:type="auto"/>
-            <w:hideMark/>
+                <w:color w:val="FF0000"/>
+                <w:sz w:val="24"/>
+                <w:szCs w:val="24"/>
+                <w:lang w:val="es-AR"/>
+              </w:rPr>
+            </w:pPr>
+            <w:r>
+              <w:rPr>
+                <w:color w:val="FF0000"/>
+                <w:lang w:val="es-AR"/>
+              </w:rPr>
+              <w:t>Django recibe una solicitud del navegador (una “</w:t>
+            </w:r>
+            <w:proofErr w:type="spellStart"/>
+            <w:r>
+              <w:rPr>
+                <w:color w:val="FF0000"/>
+                <w:lang w:val="es-AR"/>
+              </w:rPr>
+              <w:t>request</w:t>
+            </w:r>
+            <w:proofErr w:type="spellEnd"/>
+            <w:r>
+              <w:rPr>
+                <w:color w:val="FF0000"/>
+                <w:lang w:val="es-AR"/>
+              </w:rPr>
+              <w:t>”) y te la entrega como un objeto que contiene toda la información de esa visita.</w:t>
+            </w:r>
+          </w:p>
+        </w:tc>
+        <w:tc>
+          <w:tcPr>
+            <w:tcW w:w="0" w:type="auto"/>
           </w:tcPr>
           <w:p>
             <w:pPr>
               <w:cnfStyle w:val="000000100000" w:firstRow="0" w:lastRow="0" w:firstColumn="0" w:lastColumn="0" w:oddVBand="0" w:evenVBand="0" w:oddHBand="1" w:evenHBand="0" w:firstRowFirstColumn="0" w:firstRowLastColumn="0" w:lastRowFirstColumn="0" w:lastRowLastColumn="0"/>
               <w:rPr>
                 <w:rFonts w:ascii="Times New Roman" w:eastAsia="Times New Roman" w:hAnsi="Times New Roman" w:cs="Times New Roman"/>
-                <w:sz w:val="24"/>
-                <w:szCs w:val="24"/>
-              </w:rPr>
-            </w:pPr>
-            <w:proofErr w:type="spellStart"/>
-            <w:r>
-              <w:rPr>
-                <w:rFonts w:ascii="Times New Roman" w:eastAsia="Times New Roman" w:hAnsi="Times New Roman" w:cs="Times New Roman"/>
-                <w:sz w:val="24"/>
-                <w:szCs w:val="24"/>
-              </w:rPr>
-              <w:t>Dentro</w:t>
-            </w:r>
-            <w:proofErr w:type="spellEnd"/>
-            <w:r>
-              <w:rPr>
-                <w:rFonts w:ascii="Times New Roman" w:eastAsia="Times New Roman" w:hAnsi="Times New Roman" w:cs="Times New Roman"/>
-                <w:sz w:val="24"/>
-                <w:szCs w:val="24"/>
-              </w:rPr>
-              <w:t xml:space="preserve"> de </w:t>
-            </w:r>
-            <w:proofErr w:type="spellStart"/>
-            <w:r>
-              <w:rPr>
-                <w:rFonts w:ascii="Times New Roman" w:eastAsia="Times New Roman" w:hAnsi="Times New Roman" w:cs="Times New Roman"/>
-                <w:sz w:val="24"/>
-                <w:szCs w:val="24"/>
-              </w:rPr>
-              <w:t>cada</w:t>
-            </w:r>
-            <w:proofErr w:type="spellEnd"/>
-            <w:r>
-              <w:rPr>
-                <w:rFonts w:ascii="Times New Roman" w:eastAsia="Times New Roman" w:hAnsi="Times New Roman" w:cs="Times New Roman"/>
-                <w:sz w:val="24"/>
-                <w:szCs w:val="24"/>
-              </w:rPr>
-              <w:t xml:space="preserve"> app</w:t>
-            </w:r>
-          </w:p>
-        </w:tc>
-        <w:tc>
-          <w:tcPr>
-            <w:tcW w:w="0" w:type="auto"/>
-            <w:hideMark/>
+                <w:color w:val="FF0000"/>
+                <w:sz w:val="24"/>
+                <w:szCs w:val="24"/>
+                <w:lang w:val="es-AR"/>
+              </w:rPr>
+            </w:pPr>
+            <w:r>
+              <w:rPr>
+                <w:color w:val="FF0000"/>
+                <w:lang w:val="es-AR"/>
+              </w:rPr>
+              <w:t xml:space="preserve">Siempre aparece como </w:t>
+            </w:r>
+            <w:r>
+              <w:rPr>
+                <w:rStyle w:val="Textoennegrita"/>
+                <w:color w:val="FF0000"/>
+                <w:lang w:val="es-AR"/>
+              </w:rPr>
+              <w:t>parámetro en una vista</w:t>
+            </w:r>
+          </w:p>
+        </w:tc>
+        <w:tc>
+          <w:tcPr>
+            <w:tcW w:w="0" w:type="auto"/>
           </w:tcPr>
           <w:p>
             <w:pPr>
               <w:cnfStyle w:val="000000100000" w:firstRow="0" w:lastRow="0" w:firstColumn="0" w:lastColumn="0" w:oddVBand="0" w:evenVBand="0" w:oddHBand="1" w:evenHBand="0" w:firstRowFirstColumn="0" w:firstRowLastColumn="0" w:lastRowFirstColumn="0" w:lastRowLastColumn="0"/>
               <w:rPr>
-                <w:rFonts w:ascii="Times New Roman" w:eastAsia="Times New Roman" w:hAnsi="Times New Roman" w:cs="Times New Roman"/>
-                <w:sz w:val="24"/>
-                <w:szCs w:val="24"/>
-              </w:rPr>
-            </w:pPr>
-            <w:proofErr w:type="spellStart"/>
-            <w:r>
-              <w:rPr>
-                <w:rFonts w:ascii="Courier New" w:eastAsia="Times New Roman" w:hAnsi="Courier New" w:cs="Courier New"/>
-                <w:sz w:val="20"/>
-                <w:szCs w:val="20"/>
-              </w:rPr>
-              <w:t>def</w:t>
-            </w:r>
-            <w:proofErr w:type="spellEnd"/>
-            <w:r>
-              <w:rPr>
-                <w:rFonts w:ascii="Courier New" w:eastAsia="Times New Roman" w:hAnsi="Courier New" w:cs="Courier New"/>
-                <w:sz w:val="20"/>
-                <w:szCs w:val="20"/>
-              </w:rPr>
-              <w:t xml:space="preserve"> index(request): return </w:t>
-            </w:r>
-            <w:proofErr w:type="spellStart"/>
-            <w:r>
-              <w:rPr>
-                <w:rFonts w:ascii="Courier New" w:eastAsia="Times New Roman" w:hAnsi="Courier New" w:cs="Courier New"/>
-                <w:sz w:val="20"/>
-                <w:szCs w:val="20"/>
+                <w:rFonts w:ascii="Courier New" w:eastAsia="Times New Roman" w:hAnsi="Courier New" w:cs="Courier New"/>
+                <w:color w:val="FF0000"/>
+                <w:sz w:val="20"/>
+                <w:szCs w:val="20"/>
+              </w:rPr>
+            </w:pPr>
+          </w:p>
+          <w:p>
+            <w:pPr>
+              <w:cnfStyle w:val="000000100000" w:firstRow="0" w:lastRow="0" w:firstColumn="0" w:lastColumn="0" w:oddVBand="0" w:evenVBand="0" w:oddHBand="1" w:evenHBand="0" w:firstRowFirstColumn="0" w:firstRowLastColumn="0" w:lastRowFirstColumn="0" w:lastRowLastColumn="0"/>
+              <w:rPr>
+                <w:rFonts w:ascii="Courier New" w:eastAsia="Times New Roman" w:hAnsi="Courier New" w:cs="Courier New"/>
+                <w:color w:val="FF0000"/>
+                <w:sz w:val="20"/>
+                <w:szCs w:val="20"/>
+              </w:rPr>
+            </w:pPr>
+            <w:r>
+              <w:rPr>
+                <w:rFonts w:ascii="Courier New" w:eastAsia="Times New Roman" w:hAnsi="Courier New" w:cs="Courier New"/>
+                <w:color w:val="FF0000"/>
+                <w:sz w:val="20"/>
+                <w:szCs w:val="20"/>
+              </w:rPr>
+              <w:t>def index(request):</w:t>
+            </w:r>
+          </w:p>
+          <w:p>
+            <w:pPr>
+              <w:cnfStyle w:val="000000100000" w:firstRow="0" w:lastRow="0" w:firstColumn="0" w:lastColumn="0" w:oddVBand="0" w:evenVBand="0" w:oddHBand="1" w:evenHBand="0" w:firstRowFirstColumn="0" w:firstRowLastColumn="0" w:lastRowFirstColumn="0" w:lastRowLastColumn="0"/>
+              <w:rPr>
+                <w:rFonts w:ascii="Courier New" w:eastAsia="Times New Roman" w:hAnsi="Courier New" w:cs="Courier New"/>
+                <w:color w:val="FF0000"/>
+                <w:sz w:val="20"/>
+                <w:szCs w:val="20"/>
+                <w:lang w:val="es-AR"/>
+              </w:rPr>
+            </w:pPr>
+            <w:r>
+              <w:rPr>
+                <w:rFonts w:ascii="Courier New" w:eastAsia="Times New Roman" w:hAnsi="Courier New" w:cs="Courier New"/>
+                <w:color w:val="FF0000"/>
+                <w:sz w:val="20"/>
+                <w:szCs w:val="20"/>
+              </w:rPr>
+              <w:t xml:space="preserve">    </w:t>
+            </w:r>
+            <w:proofErr w:type="spellStart"/>
+            <w:r>
+              <w:rPr>
+                <w:rFonts w:ascii="Courier New" w:eastAsia="Times New Roman" w:hAnsi="Courier New" w:cs="Courier New"/>
+                <w:color w:val="FF0000"/>
+                <w:sz w:val="20"/>
+                <w:szCs w:val="20"/>
+                <w:lang w:val="es-AR"/>
+              </w:rPr>
+              <w:t>return</w:t>
+            </w:r>
+            <w:proofErr w:type="spellEnd"/>
+            <w:r>
+              <w:rPr>
+                <w:rFonts w:ascii="Courier New" w:eastAsia="Times New Roman" w:hAnsi="Courier New" w:cs="Courier New"/>
+                <w:color w:val="FF0000"/>
+                <w:sz w:val="20"/>
+                <w:szCs w:val="20"/>
+                <w:lang w:val="es-AR"/>
+              </w:rPr>
+              <w:t xml:space="preserve"> </w:t>
+            </w:r>
+            <w:proofErr w:type="spellStart"/>
+            <w:r>
+              <w:rPr>
+                <w:rFonts w:ascii="Courier New" w:eastAsia="Times New Roman" w:hAnsi="Courier New" w:cs="Courier New"/>
+                <w:color w:val="FF0000"/>
+                <w:sz w:val="20"/>
+                <w:szCs w:val="20"/>
+                <w:lang w:val="es-AR"/>
               </w:rPr>
               <w:t>HttpResponse</w:t>
             </w:r>
@@ -873,10 +995,12 @@
             <w:r>
               <w:rPr>
                 <w:rFonts w:ascii="Courier New" w:eastAsia="Times New Roman" w:hAnsi="Courier New" w:cs="Courier New"/>
-                <w:sz w:val="20"/>
-                <w:szCs w:val="20"/>
-              </w:rPr>
-              <w:t>(...)</w:t>
+                <w:color w:val="FF0000"/>
+                <w:sz w:val="20"/>
+                <w:szCs w:val="20"/>
+                <w:lang w:val="es-AR"/>
+              </w:rPr>
+              <w:t>("Hola mundo")</w:t>
             </w:r>
           </w:p>
         </w:tc>
@@ -886,20 +1010,21 @@
           <w:tcPr>
             <w:cnfStyle w:val="001000000000" w:firstRow="0" w:lastRow="0" w:firstColumn="1" w:lastColumn="0" w:oddVBand="0" w:evenVBand="0" w:oddHBand="0" w:evenHBand="0" w:firstRowFirstColumn="0" w:firstRowLastColumn="0" w:lastRowFirstColumn="0" w:lastRowLastColumn="0"/>
             <w:tcW w:w="0" w:type="auto"/>
-            <w:hideMark/>
-          </w:tcPr>
-          <w:p>
-            <w:pPr>
-              <w:rPr>
-                <w:rFonts w:ascii="Times New Roman" w:eastAsia="Times New Roman" w:hAnsi="Times New Roman" w:cs="Times New Roman"/>
-                <w:sz w:val="24"/>
-                <w:szCs w:val="24"/>
-              </w:rPr>
-            </w:pPr>
-            <w:proofErr w:type="spellStart"/>
-            <w:r>
-              <w:rPr>
-                <w:rFonts w:ascii="Courier New" w:eastAsia="Times New Roman" w:hAnsi="Courier New" w:cs="Courier New"/>
+          </w:tcPr>
+          <w:p>
+            <w:pPr>
+              <w:rPr>
+                <w:rFonts w:ascii="Times New Roman" w:eastAsia="Times New Roman" w:hAnsi="Times New Roman" w:cs="Times New Roman"/>
+                <w:color w:val="FF0000"/>
+                <w:sz w:val="24"/>
+                <w:szCs w:val="24"/>
+              </w:rPr>
+            </w:pPr>
+            <w:proofErr w:type="spellStart"/>
+            <w:r>
+              <w:rPr>
+                <w:rFonts w:ascii="Courier New" w:eastAsia="Times New Roman" w:hAnsi="Courier New" w:cs="Courier New"/>
+                <w:color w:val="FF0000"/>
                 <w:sz w:val="20"/>
                 <w:szCs w:val="20"/>
               </w:rPr>
@@ -911,47 +1036,82 @@
         <w:tc>
           <w:tcPr>
             <w:tcW w:w="0" w:type="auto"/>
-            <w:hideMark/>
           </w:tcPr>
           <w:p>
             <w:pPr>
               <w:cnfStyle w:val="000000000000" w:firstRow="0" w:lastRow="0" w:firstColumn="0" w:lastColumn="0" w:oddVBand="0" w:evenVBand="0" w:oddHBand="0" w:evenHBand="0" w:firstRowFirstColumn="0" w:firstRowLastColumn="0" w:lastRowFirstColumn="0" w:lastRowLastColumn="0"/>
               <w:rPr>
                 <w:rFonts w:ascii="Times New Roman" w:eastAsia="Times New Roman" w:hAnsi="Times New Roman" w:cs="Times New Roman"/>
-                <w:sz w:val="24"/>
-                <w:szCs w:val="24"/>
-                <w:lang w:val="es-AR"/>
-              </w:rPr>
-            </w:pPr>
-            <w:r>
-              <w:rPr>
-                <w:rFonts w:ascii="Times New Roman" w:eastAsia="Times New Roman" w:hAnsi="Times New Roman" w:cs="Times New Roman"/>
+                <w:color w:val="FF0000"/>
+                <w:sz w:val="24"/>
+                <w:szCs w:val="24"/>
+                <w:lang w:val="es-AR"/>
+              </w:rPr>
+            </w:pPr>
+            <w:r>
+              <w:rPr>
+                <w:rFonts w:ascii="Times New Roman" w:eastAsia="Times New Roman" w:hAnsi="Times New Roman" w:cs="Times New Roman"/>
+                <w:color w:val="FF0000"/>
                 <w:sz w:val="24"/>
                 <w:szCs w:val="24"/>
                 <w:lang w:val="es-AR"/>
               </w:rPr>
               <w:t>Lista de rutas que Django usa para direccionar peticiones</w:t>
             </w:r>
-          </w:p>
-        </w:tc>
-        <w:tc>
-          <w:tcPr>
-            <w:tcW w:w="0" w:type="auto"/>
-            <w:hideMark/>
+            <w:r>
+              <w:rPr>
+                <w:rFonts w:ascii="Times New Roman" w:eastAsia="Times New Roman" w:hAnsi="Times New Roman" w:cs="Times New Roman"/>
+                <w:color w:val="FF0000"/>
+                <w:sz w:val="24"/>
+                <w:szCs w:val="24"/>
+                <w:lang w:val="es-AR"/>
+              </w:rPr>
+              <w:t xml:space="preserve">. </w:t>
+            </w:r>
+            <w:r>
+              <w:rPr>
+                <w:color w:val="FF0000"/>
+                <w:lang w:val="es-AR"/>
+              </w:rPr>
+              <w:t xml:space="preserve">“Si el usuario entra a esta URL, </w:t>
+            </w:r>
+            <w:proofErr w:type="spellStart"/>
+            <w:r>
+              <w:rPr>
+                <w:color w:val="FF0000"/>
+                <w:lang w:val="es-AR"/>
+              </w:rPr>
+              <w:t>mostrá</w:t>
+            </w:r>
+            <w:proofErr w:type="spellEnd"/>
+            <w:r>
+              <w:rPr>
+                <w:color w:val="FF0000"/>
+                <w:lang w:val="es-AR"/>
+              </w:rPr>
+              <w:t xml:space="preserve"> esta vista”.</w:t>
+            </w:r>
+          </w:p>
+        </w:tc>
+        <w:tc>
+          <w:tcPr>
+            <w:tcW w:w="0" w:type="auto"/>
           </w:tcPr>
           <w:p>
             <w:pPr>
               <w:cnfStyle w:val="000000000000" w:firstRow="0" w:lastRow="0" w:firstColumn="0" w:lastColumn="0" w:oddVBand="0" w:evenVBand="0" w:oddHBand="0" w:evenHBand="0" w:firstRowFirstColumn="0" w:firstRowLastColumn="0" w:lastRowFirstColumn="0" w:lastRowLastColumn="0"/>
               <w:rPr>
                 <w:rFonts w:ascii="Times New Roman" w:eastAsia="Times New Roman" w:hAnsi="Times New Roman" w:cs="Times New Roman"/>
-                <w:sz w:val="24"/>
-                <w:szCs w:val="24"/>
-                <w:lang w:val="es-AR"/>
-              </w:rPr>
-            </w:pPr>
-            <w:r>
-              <w:rPr>
-                <w:rFonts w:ascii="Times New Roman" w:eastAsia="Times New Roman" w:hAnsi="Times New Roman" w:cs="Times New Roman"/>
+                <w:color w:val="FF0000"/>
+                <w:sz w:val="24"/>
+                <w:szCs w:val="24"/>
+                <w:lang w:val="es-AR"/>
+              </w:rPr>
+            </w:pPr>
+            <w:r>
+              <w:rPr>
+                <w:rFonts w:ascii="Times New Roman" w:eastAsia="Times New Roman" w:hAnsi="Times New Roman" w:cs="Times New Roman"/>
+                <w:color w:val="FF0000"/>
                 <w:sz w:val="24"/>
                 <w:szCs w:val="24"/>
                 <w:lang w:val="es-AR"/>
@@ -961,6 +1121,7 @@
             <w:r>
               <w:rPr>
                 <w:rFonts w:ascii="Courier New" w:eastAsia="Times New Roman" w:hAnsi="Courier New" w:cs="Courier New"/>
+                <w:color w:val="FF0000"/>
                 <w:sz w:val="20"/>
                 <w:szCs w:val="20"/>
                 <w:lang w:val="es-AR"/>
@@ -970,6 +1131,7 @@
             <w:r>
               <w:rPr>
                 <w:rFonts w:ascii="Times New Roman" w:eastAsia="Times New Roman" w:hAnsi="Times New Roman" w:cs="Times New Roman"/>
+                <w:color w:val="FF0000"/>
                 <w:sz w:val="24"/>
                 <w:szCs w:val="24"/>
                 <w:lang w:val="es-AR"/>
@@ -981,23 +1143,26 @@
         <w:tc>
           <w:tcPr>
             <w:tcW w:w="0" w:type="auto"/>
-            <w:hideMark/>
           </w:tcPr>
           <w:p>
             <w:pPr>
               <w:cnfStyle w:val="000000000000" w:firstRow="0" w:lastRow="0" w:firstColumn="0" w:lastColumn="0" w:oddVBand="0" w:evenVBand="0" w:oddHBand="0" w:evenHBand="0" w:firstRowFirstColumn="0" w:firstRowLastColumn="0" w:lastRowFirstColumn="0" w:lastRowLastColumn="0"/>
               <w:rPr>
                 <w:rFonts w:ascii="Times New Roman" w:eastAsia="Times New Roman" w:hAnsi="Times New Roman" w:cs="Times New Roman"/>
-                <w:sz w:val="24"/>
-                <w:szCs w:val="24"/>
-              </w:rPr>
-            </w:pPr>
-            <w:proofErr w:type="spellStart"/>
-            <w:r>
-              <w:rPr>
-                <w:rFonts w:ascii="Courier New" w:eastAsia="Times New Roman" w:hAnsi="Courier New" w:cs="Courier New"/>
-                <w:sz w:val="20"/>
-                <w:szCs w:val="20"/>
+                <w:color w:val="FF0000"/>
+                <w:sz w:val="24"/>
+                <w:szCs w:val="24"/>
+                <w:lang w:val="es-AR"/>
+              </w:rPr>
+            </w:pPr>
+            <w:proofErr w:type="spellStart"/>
+            <w:r>
+              <w:rPr>
+                <w:rFonts w:ascii="Courier New" w:eastAsia="Times New Roman" w:hAnsi="Courier New" w:cs="Courier New"/>
+                <w:color w:val="FF0000"/>
+                <w:sz w:val="20"/>
+                <w:szCs w:val="20"/>
+                <w:lang w:val="es-AR"/>
               </w:rPr>
               <w:t>urlpatterns</w:t>
             </w:r>
@@ -1005,17 +1170,43 @@
             <w:r>
               <w:rPr>
                 <w:rFonts w:ascii="Courier New" w:eastAsia="Times New Roman" w:hAnsi="Courier New" w:cs="Courier New"/>
-                <w:sz w:val="20"/>
-                <w:szCs w:val="20"/>
-              </w:rPr>
-              <w:t xml:space="preserve"> = [ path('', </w:t>
-            </w:r>
-            <w:proofErr w:type="spellStart"/>
-            <w:r>
-              <w:rPr>
-                <w:rFonts w:ascii="Courier New" w:eastAsia="Times New Roman" w:hAnsi="Courier New" w:cs="Courier New"/>
-                <w:sz w:val="20"/>
-                <w:szCs w:val="20"/>
+                <w:color w:val="FF0000"/>
+                <w:sz w:val="20"/>
+                <w:szCs w:val="20"/>
+                <w:lang w:val="es-AR"/>
+              </w:rPr>
+              <w:t xml:space="preserve"> = [ </w:t>
+            </w:r>
+            <w:proofErr w:type="spellStart"/>
+            <w:r>
+              <w:rPr>
+                <w:rFonts w:ascii="Courier New" w:eastAsia="Times New Roman" w:hAnsi="Courier New" w:cs="Courier New"/>
+                <w:color w:val="FF0000"/>
+                <w:sz w:val="20"/>
+                <w:szCs w:val="20"/>
+                <w:lang w:val="es-AR"/>
+              </w:rPr>
+              <w:t>path</w:t>
+            </w:r>
+            <w:proofErr w:type="spellEnd"/>
+            <w:r>
+              <w:rPr>
+                <w:rFonts w:ascii="Courier New" w:eastAsia="Times New Roman" w:hAnsi="Courier New" w:cs="Courier New"/>
+                <w:color w:val="FF0000"/>
+                <w:sz w:val="20"/>
+                <w:szCs w:val="20"/>
+                <w:lang w:val="es-AR"/>
+              </w:rPr>
+              <w:t xml:space="preserve">('', </w:t>
+            </w:r>
+            <w:proofErr w:type="spellStart"/>
+            <w:r>
+              <w:rPr>
+                <w:rFonts w:ascii="Courier New" w:eastAsia="Times New Roman" w:hAnsi="Courier New" w:cs="Courier New"/>
+                <w:color w:val="FF0000"/>
+                <w:sz w:val="20"/>
+                <w:szCs w:val="20"/>
+                <w:lang w:val="es-AR"/>
               </w:rPr>
               <w:t>views.index</w:t>
             </w:r>
@@ -1023,8 +1214,10 @@
             <w:r>
               <w:rPr>
                 <w:rFonts w:ascii="Courier New" w:eastAsia="Times New Roman" w:hAnsi="Courier New" w:cs="Courier New"/>
-                <w:sz w:val="20"/>
-                <w:szCs w:val="20"/>
+                <w:color w:val="FF0000"/>
+                <w:sz w:val="20"/>
+                <w:szCs w:val="20"/>
+                <w:lang w:val="es-AR"/>
               </w:rPr>
               <w:t>) ]</w:t>
             </w:r>
@@ -1039,110 +1232,77 @@
           <w:tcPr>
             <w:cnfStyle w:val="001000000000" w:firstRow="0" w:lastRow="0" w:firstColumn="1" w:lastColumn="0" w:oddVBand="0" w:evenVBand="0" w:oddHBand="0" w:evenHBand="0" w:firstRowFirstColumn="0" w:firstRowLastColumn="0" w:lastRowFirstColumn="0" w:lastRowLastColumn="0"/>
             <w:tcW w:w="0" w:type="auto"/>
-            <w:hideMark/>
-          </w:tcPr>
-          <w:p>
-            <w:pPr>
-              <w:rPr>
-                <w:rFonts w:ascii="Times New Roman" w:eastAsia="Times New Roman" w:hAnsi="Times New Roman" w:cs="Times New Roman"/>
-                <w:sz w:val="24"/>
-                <w:szCs w:val="24"/>
-              </w:rPr>
-            </w:pPr>
-            <w:r>
-              <w:rPr>
-                <w:rFonts w:ascii="Courier New" w:eastAsia="Times New Roman" w:hAnsi="Courier New" w:cs="Courier New"/>
-                <w:sz w:val="20"/>
-                <w:szCs w:val="20"/>
-              </w:rPr>
-              <w:t>include()</w:t>
-            </w:r>
-          </w:p>
-        </w:tc>
-        <w:tc>
-          <w:tcPr>
-            <w:tcW w:w="0" w:type="auto"/>
-            <w:hideMark/>
+          </w:tcPr>
+          <w:p>
+            <w:pPr>
+              <w:rPr>
+                <w:rFonts w:ascii="Times New Roman" w:eastAsia="Times New Roman" w:hAnsi="Times New Roman" w:cs="Times New Roman"/>
+                <w:color w:val="FF0000"/>
+                <w:sz w:val="24"/>
+                <w:szCs w:val="24"/>
+              </w:rPr>
+            </w:pPr>
+            <w:r>
+              <w:rPr>
+                <w:rFonts w:ascii="Courier New" w:eastAsia="Times New Roman" w:hAnsi="Courier New" w:cs="Courier New"/>
+                <w:color w:val="FF0000"/>
+                <w:sz w:val="20"/>
+                <w:szCs w:val="20"/>
+              </w:rPr>
+              <w:t>path()</w:t>
+            </w:r>
+          </w:p>
+        </w:tc>
+        <w:tc>
+          <w:tcPr>
+            <w:tcW w:w="0" w:type="auto"/>
           </w:tcPr>
           <w:p>
             <w:pPr>
               <w:cnfStyle w:val="000000100000" w:firstRow="0" w:lastRow="0" w:firstColumn="0" w:lastColumn="0" w:oddVBand="0" w:evenVBand="0" w:oddHBand="1" w:evenHBand="0" w:firstRowFirstColumn="0" w:firstRowLastColumn="0" w:lastRowFirstColumn="0" w:lastRowLastColumn="0"/>
               <w:rPr>
                 <w:rFonts w:ascii="Times New Roman" w:eastAsia="Times New Roman" w:hAnsi="Times New Roman" w:cs="Times New Roman"/>
-                <w:sz w:val="24"/>
-                <w:szCs w:val="24"/>
-                <w:lang w:val="es-AR"/>
-              </w:rPr>
-            </w:pPr>
-            <w:r>
-              <w:rPr>
-                <w:rFonts w:ascii="Times New Roman" w:eastAsia="Times New Roman" w:hAnsi="Times New Roman" w:cs="Times New Roman"/>
-                <w:sz w:val="24"/>
-                <w:szCs w:val="24"/>
-                <w:lang w:val="es-AR"/>
-              </w:rPr>
-              <w:t xml:space="preserve">Permite incluir </w:t>
-            </w:r>
-            <w:proofErr w:type="spellStart"/>
-            <w:r>
-              <w:rPr>
-                <w:rFonts w:ascii="Times New Roman" w:eastAsia="Times New Roman" w:hAnsi="Times New Roman" w:cs="Times New Roman"/>
-                <w:sz w:val="24"/>
-                <w:szCs w:val="24"/>
-                <w:lang w:val="es-AR"/>
-              </w:rPr>
-              <w:t>URLs</w:t>
-            </w:r>
-            <w:proofErr w:type="spellEnd"/>
-            <w:r>
-              <w:rPr>
-                <w:rFonts w:ascii="Times New Roman" w:eastAsia="Times New Roman" w:hAnsi="Times New Roman" w:cs="Times New Roman"/>
-                <w:sz w:val="24"/>
-                <w:szCs w:val="24"/>
-                <w:lang w:val="es-AR"/>
-              </w:rPr>
-              <w:t xml:space="preserve"> de una app en las </w:t>
-            </w:r>
-            <w:proofErr w:type="spellStart"/>
-            <w:r>
-              <w:rPr>
-                <w:rFonts w:ascii="Times New Roman" w:eastAsia="Times New Roman" w:hAnsi="Times New Roman" w:cs="Times New Roman"/>
-                <w:sz w:val="24"/>
-                <w:szCs w:val="24"/>
-                <w:lang w:val="es-AR"/>
-              </w:rPr>
-              <w:t>URLs</w:t>
-            </w:r>
-            <w:proofErr w:type="spellEnd"/>
-            <w:r>
-              <w:rPr>
-                <w:rFonts w:ascii="Times New Roman" w:eastAsia="Times New Roman" w:hAnsi="Times New Roman" w:cs="Times New Roman"/>
-                <w:sz w:val="24"/>
-                <w:szCs w:val="24"/>
-                <w:lang w:val="es-AR"/>
-              </w:rPr>
-              <w:t xml:space="preserve"> del proyecto</w:t>
-            </w:r>
-          </w:p>
-        </w:tc>
-        <w:tc>
-          <w:tcPr>
-            <w:tcW w:w="0" w:type="auto"/>
-            <w:hideMark/>
+                <w:color w:val="FF0000"/>
+                <w:sz w:val="24"/>
+                <w:szCs w:val="24"/>
+                <w:lang w:val="es-AR"/>
+              </w:rPr>
+            </w:pPr>
+            <w:r>
+              <w:rPr>
+                <w:color w:val="FF0000"/>
+                <w:lang w:val="es-AR"/>
+              </w:rPr>
+              <w:t>C</w:t>
+            </w:r>
+            <w:r>
+              <w:rPr>
+                <w:color w:val="FF0000"/>
+                <w:lang w:val="es-AR"/>
+              </w:rPr>
+              <w:t>onecta una URL con una vista</w:t>
+            </w:r>
+          </w:p>
+        </w:tc>
+        <w:tc>
+          <w:tcPr>
+            <w:tcW w:w="0" w:type="auto"/>
           </w:tcPr>
           <w:p>
             <w:pPr>
               <w:cnfStyle w:val="000000100000" w:firstRow="0" w:lastRow="0" w:firstColumn="0" w:lastColumn="0" w:oddVBand="0" w:evenVBand="0" w:oddHBand="1" w:evenHBand="0" w:firstRowFirstColumn="0" w:firstRowLastColumn="0" w:lastRowFirstColumn="0" w:lastRowLastColumn="0"/>
               <w:rPr>
                 <w:rFonts w:ascii="Times New Roman" w:eastAsia="Times New Roman" w:hAnsi="Times New Roman" w:cs="Times New Roman"/>
-                <w:sz w:val="24"/>
-                <w:szCs w:val="24"/>
-              </w:rPr>
-            </w:pPr>
-            <w:proofErr w:type="spellStart"/>
-            <w:r>
-              <w:rPr>
-                <w:rFonts w:ascii="Times New Roman" w:eastAsia="Times New Roman" w:hAnsi="Times New Roman" w:cs="Times New Roman"/>
+                <w:color w:val="FF0000"/>
+                <w:sz w:val="24"/>
+                <w:szCs w:val="24"/>
+              </w:rPr>
+            </w:pPr>
+            <w:proofErr w:type="spellStart"/>
+            <w:r>
+              <w:rPr>
+                <w:rFonts w:ascii="Times New Roman" w:eastAsia="Times New Roman" w:hAnsi="Times New Roman" w:cs="Times New Roman"/>
+                <w:color w:val="FF0000"/>
                 <w:sz w:val="24"/>
                 <w:szCs w:val="24"/>
               </w:rPr>
@@ -1152,6 +1312,7 @@
             <w:r>
               <w:rPr>
                 <w:rFonts w:ascii="Times New Roman" w:eastAsia="Times New Roman" w:hAnsi="Times New Roman" w:cs="Times New Roman"/>
+                <w:color w:val="FF0000"/>
                 <w:sz w:val="24"/>
                 <w:szCs w:val="24"/>
               </w:rPr>
@@ -1160,52 +1321,56 @@
             <w:r>
               <w:rPr>
                 <w:rFonts w:ascii="Courier New" w:eastAsia="Times New Roman" w:hAnsi="Courier New" w:cs="Courier New"/>
-                <w:sz w:val="20"/>
-                <w:szCs w:val="20"/>
-              </w:rPr>
-              <w:t>mercadoweb/urls.py</w:t>
-            </w:r>
-          </w:p>
-        </w:tc>
-        <w:tc>
-          <w:tcPr>
-            <w:tcW w:w="0" w:type="auto"/>
-            <w:hideMark/>
+                <w:color w:val="FF0000"/>
+                <w:sz w:val="20"/>
+                <w:szCs w:val="20"/>
+              </w:rPr>
+              <w:t>urls.py</w:t>
+            </w:r>
+          </w:p>
+        </w:tc>
+        <w:tc>
+          <w:tcPr>
+            <w:tcW w:w="0" w:type="auto"/>
           </w:tcPr>
           <w:p>
             <w:pPr>
               <w:cnfStyle w:val="000000100000" w:firstRow="0" w:lastRow="0" w:firstColumn="0" w:lastColumn="0" w:oddVBand="0" w:evenVBand="0" w:oddHBand="1" w:evenHBand="0" w:firstRowFirstColumn="0" w:firstRowLastColumn="0" w:lastRowFirstColumn="0" w:lastRowLastColumn="0"/>
               <w:rPr>
                 <w:rFonts w:ascii="Times New Roman" w:eastAsia="Times New Roman" w:hAnsi="Times New Roman" w:cs="Times New Roman"/>
-                <w:sz w:val="24"/>
-                <w:szCs w:val="24"/>
-              </w:rPr>
-            </w:pPr>
-            <w:r>
-              <w:rPr>
-                <w:rFonts w:ascii="Courier New" w:eastAsia="Times New Roman" w:hAnsi="Courier New" w:cs="Courier New"/>
-                <w:sz w:val="20"/>
-                <w:szCs w:val="20"/>
-              </w:rPr>
-              <w:t>path('', include('</w:t>
-            </w:r>
-            <w:proofErr w:type="spellStart"/>
-            <w:r>
-              <w:rPr>
-                <w:rFonts w:ascii="Courier New" w:eastAsia="Times New Roman" w:hAnsi="Courier New" w:cs="Courier New"/>
-                <w:sz w:val="20"/>
-                <w:szCs w:val="20"/>
-              </w:rPr>
-              <w:t>producto.urls</w:t>
-            </w:r>
-            <w:proofErr w:type="spellEnd"/>
-            <w:r>
-              <w:rPr>
-                <w:rFonts w:ascii="Courier New" w:eastAsia="Times New Roman" w:hAnsi="Courier New" w:cs="Courier New"/>
-                <w:sz w:val="20"/>
-                <w:szCs w:val="20"/>
-              </w:rPr>
-              <w:t>'))</w:t>
+                <w:color w:val="FF0000"/>
+                <w:sz w:val="24"/>
+                <w:szCs w:val="24"/>
+              </w:rPr>
+            </w:pPr>
+            <w:r>
+              <w:rPr>
+                <w:rFonts w:ascii="Courier New" w:eastAsia="Times New Roman" w:hAnsi="Courier New" w:cs="Courier New"/>
+                <w:color w:val="FF0000"/>
+                <w:sz w:val="20"/>
+                <w:szCs w:val="20"/>
+              </w:rPr>
+              <w:t xml:space="preserve">path('admin/', </w:t>
+            </w:r>
+            <w:proofErr w:type="spellStart"/>
+            <w:r>
+              <w:rPr>
+                <w:rFonts w:ascii="Courier New" w:eastAsia="Times New Roman" w:hAnsi="Courier New" w:cs="Courier New"/>
+                <w:color w:val="FF0000"/>
+                <w:sz w:val="20"/>
+                <w:szCs w:val="20"/>
+              </w:rPr>
+              <w:t>admin.site.urls</w:t>
+            </w:r>
+            <w:proofErr w:type="spellEnd"/>
+            <w:r>
+              <w:rPr>
+                <w:rFonts w:ascii="Courier New" w:eastAsia="Times New Roman" w:hAnsi="Courier New" w:cs="Courier New"/>
+                <w:color w:val="FF0000"/>
+                <w:sz w:val="20"/>
+                <w:szCs w:val="20"/>
+              </w:rPr>
+              <w:t>)</w:t>
             </w:r>
           </w:p>
         </w:tc>
@@ -1215,180 +1380,197 @@
           <w:tcPr>
             <w:cnfStyle w:val="001000000000" w:firstRow="0" w:lastRow="0" w:firstColumn="1" w:lastColumn="0" w:oddVBand="0" w:evenVBand="0" w:oddHBand="0" w:evenHBand="0" w:firstRowFirstColumn="0" w:firstRowLastColumn="0" w:lastRowFirstColumn="0" w:lastRowLastColumn="0"/>
             <w:tcW w:w="0" w:type="auto"/>
-            <w:hideMark/>
-          </w:tcPr>
-          <w:p>
-            <w:pPr>
-              <w:rPr>
-                <w:rFonts w:ascii="Times New Roman" w:eastAsia="Times New Roman" w:hAnsi="Times New Roman" w:cs="Times New Roman"/>
-                <w:sz w:val="24"/>
-                <w:szCs w:val="24"/>
-              </w:rPr>
-            </w:pPr>
-            <w:proofErr w:type="spellStart"/>
-            <w:r>
-              <w:rPr>
-                <w:rFonts w:ascii="Courier New" w:eastAsia="Times New Roman" w:hAnsi="Courier New" w:cs="Courier New"/>
-                <w:sz w:val="20"/>
-                <w:szCs w:val="20"/>
+          </w:tcPr>
+          <w:p>
+            <w:pPr>
+              <w:rPr>
+                <w:rFonts w:ascii="Times New Roman" w:eastAsia="Times New Roman" w:hAnsi="Times New Roman" w:cs="Times New Roman"/>
+                <w:color w:val="FF0000"/>
+                <w:sz w:val="24"/>
+                <w:szCs w:val="24"/>
+              </w:rPr>
+            </w:pPr>
+            <w:r>
+              <w:rPr>
+                <w:rFonts w:ascii="Courier New" w:eastAsia="Times New Roman" w:hAnsi="Courier New" w:cs="Courier New"/>
+                <w:color w:val="FF0000"/>
+                <w:sz w:val="20"/>
+                <w:szCs w:val="20"/>
+              </w:rPr>
+              <w:t>include()</w:t>
+            </w:r>
+          </w:p>
+        </w:tc>
+        <w:tc>
+          <w:tcPr>
+            <w:tcW w:w="0" w:type="auto"/>
+          </w:tcPr>
+          <w:p>
+            <w:pPr>
+              <w:cnfStyle w:val="000000000000" w:firstRow="0" w:lastRow="0" w:firstColumn="0" w:lastColumn="0" w:oddVBand="0" w:evenVBand="0" w:oddHBand="0" w:evenHBand="0" w:firstRowFirstColumn="0" w:firstRowLastColumn="0" w:lastRowFirstColumn="0" w:lastRowLastColumn="0"/>
+              <w:rPr>
+                <w:rFonts w:ascii="Times New Roman" w:eastAsia="Times New Roman" w:hAnsi="Times New Roman" w:cs="Times New Roman"/>
+                <w:color w:val="FF0000"/>
+                <w:sz w:val="24"/>
+                <w:szCs w:val="24"/>
+                <w:lang w:val="es-AR"/>
+              </w:rPr>
+            </w:pPr>
+            <w:r>
+              <w:rPr>
+                <w:rFonts w:ascii="Times New Roman" w:eastAsia="Times New Roman" w:hAnsi="Times New Roman" w:cs="Times New Roman"/>
+                <w:color w:val="FF0000"/>
+                <w:sz w:val="24"/>
+                <w:szCs w:val="24"/>
+                <w:lang w:val="es-AR"/>
+              </w:rPr>
+              <w:t xml:space="preserve">Permite incluir </w:t>
+            </w:r>
+            <w:proofErr w:type="spellStart"/>
+            <w:r>
+              <w:rPr>
+                <w:rFonts w:ascii="Times New Roman" w:eastAsia="Times New Roman" w:hAnsi="Times New Roman" w:cs="Times New Roman"/>
+                <w:color w:val="FF0000"/>
+                <w:sz w:val="24"/>
+                <w:szCs w:val="24"/>
+                <w:lang w:val="es-AR"/>
+              </w:rPr>
+              <w:t>URLs</w:t>
+            </w:r>
+            <w:proofErr w:type="spellEnd"/>
+            <w:r>
+              <w:rPr>
+                <w:rFonts w:ascii="Times New Roman" w:eastAsia="Times New Roman" w:hAnsi="Times New Roman" w:cs="Times New Roman"/>
+                <w:color w:val="FF0000"/>
+                <w:sz w:val="24"/>
+                <w:szCs w:val="24"/>
+                <w:lang w:val="es-AR"/>
+              </w:rPr>
+              <w:t xml:space="preserve"> de </w:t>
+            </w:r>
+            <w:r>
+              <w:rPr>
+                <w:rFonts w:ascii="Times New Roman" w:eastAsia="Times New Roman" w:hAnsi="Times New Roman" w:cs="Times New Roman"/>
+                <w:color w:val="FF0000"/>
+                <w:sz w:val="24"/>
+                <w:szCs w:val="24"/>
+                <w:lang w:val="es-AR"/>
               </w:rPr>
               <w:lastRenderedPageBreak/>
-              <w:t>HttpResponse</w:t>
-            </w:r>
-            <w:proofErr w:type="spellEnd"/>
-            <w:r>
-              <w:rPr>
-                <w:rFonts w:ascii="Courier New" w:eastAsia="Times New Roman" w:hAnsi="Courier New" w:cs="Courier New"/>
-                <w:sz w:val="20"/>
-                <w:szCs w:val="20"/>
-              </w:rPr>
-              <w:t>()</w:t>
-            </w:r>
-          </w:p>
-        </w:tc>
-        <w:tc>
-          <w:tcPr>
-            <w:tcW w:w="0" w:type="auto"/>
-            <w:hideMark/>
+              <w:t xml:space="preserve">una app en las </w:t>
+            </w:r>
+            <w:proofErr w:type="spellStart"/>
+            <w:r>
+              <w:rPr>
+                <w:rFonts w:ascii="Times New Roman" w:eastAsia="Times New Roman" w:hAnsi="Times New Roman" w:cs="Times New Roman"/>
+                <w:color w:val="FF0000"/>
+                <w:sz w:val="24"/>
+                <w:szCs w:val="24"/>
+                <w:lang w:val="es-AR"/>
+              </w:rPr>
+              <w:t>URLs</w:t>
+            </w:r>
+            <w:proofErr w:type="spellEnd"/>
+            <w:r>
+              <w:rPr>
+                <w:rFonts w:ascii="Times New Roman" w:eastAsia="Times New Roman" w:hAnsi="Times New Roman" w:cs="Times New Roman"/>
+                <w:color w:val="FF0000"/>
+                <w:sz w:val="24"/>
+                <w:szCs w:val="24"/>
+                <w:lang w:val="es-AR"/>
+              </w:rPr>
+              <w:t xml:space="preserve"> del proyecto</w:t>
+            </w:r>
+          </w:p>
+        </w:tc>
+        <w:tc>
+          <w:tcPr>
+            <w:tcW w:w="0" w:type="auto"/>
           </w:tcPr>
           <w:p>
             <w:pPr>
               <w:cnfStyle w:val="000000000000" w:firstRow="0" w:lastRow="0" w:firstColumn="0" w:lastColumn="0" w:oddVBand="0" w:evenVBand="0" w:oddHBand="0" w:evenHBand="0" w:firstRowFirstColumn="0" w:firstRowLastColumn="0" w:lastRowFirstColumn="0" w:lastRowLastColumn="0"/>
               <w:rPr>
                 <w:rFonts w:ascii="Times New Roman" w:eastAsia="Times New Roman" w:hAnsi="Times New Roman" w:cs="Times New Roman"/>
-                <w:sz w:val="24"/>
-                <w:szCs w:val="24"/>
-                <w:lang w:val="es-AR"/>
-              </w:rPr>
-            </w:pPr>
-            <w:r>
-              <w:rPr>
-                <w:rFonts w:ascii="Times New Roman" w:eastAsia="Times New Roman" w:hAnsi="Times New Roman" w:cs="Times New Roman"/>
-                <w:sz w:val="24"/>
-                <w:szCs w:val="24"/>
-                <w:lang w:val="es-AR"/>
-              </w:rPr>
-              <w:t>Función que devuelve texto simple como respuesta HTTP</w:t>
-            </w:r>
-          </w:p>
-        </w:tc>
-        <w:tc>
-          <w:tcPr>
-            <w:tcW w:w="0" w:type="auto"/>
-            <w:hideMark/>
+                <w:color w:val="FF0000"/>
+                <w:sz w:val="24"/>
+                <w:szCs w:val="24"/>
+              </w:rPr>
+            </w:pPr>
+            <w:proofErr w:type="spellStart"/>
+            <w:r>
+              <w:rPr>
+                <w:rFonts w:ascii="Times New Roman" w:eastAsia="Times New Roman" w:hAnsi="Times New Roman" w:cs="Times New Roman"/>
+                <w:color w:val="FF0000"/>
+                <w:sz w:val="24"/>
+                <w:szCs w:val="24"/>
+              </w:rPr>
+              <w:lastRenderedPageBreak/>
+              <w:t>En</w:t>
+            </w:r>
+            <w:proofErr w:type="spellEnd"/>
+            <w:r>
+              <w:rPr>
+                <w:rFonts w:ascii="Times New Roman" w:eastAsia="Times New Roman" w:hAnsi="Times New Roman" w:cs="Times New Roman"/>
+                <w:color w:val="FF0000"/>
+                <w:sz w:val="24"/>
+                <w:szCs w:val="24"/>
+              </w:rPr>
+              <w:t xml:space="preserve"> </w:t>
+            </w:r>
+            <w:r>
+              <w:rPr>
+                <w:rFonts w:ascii="Courier New" w:eastAsia="Times New Roman" w:hAnsi="Courier New" w:cs="Courier New"/>
+                <w:color w:val="FF0000"/>
+                <w:sz w:val="20"/>
+                <w:szCs w:val="20"/>
+              </w:rPr>
+              <w:t>mercadoweb/urls.py</w:t>
+            </w:r>
+          </w:p>
+        </w:tc>
+        <w:tc>
+          <w:tcPr>
+            <w:tcW w:w="0" w:type="auto"/>
           </w:tcPr>
           <w:p>
             <w:pPr>
               <w:cnfStyle w:val="000000000000" w:firstRow="0" w:lastRow="0" w:firstColumn="0" w:lastColumn="0" w:oddVBand="0" w:evenVBand="0" w:oddHBand="0" w:evenHBand="0" w:firstRowFirstColumn="0" w:firstRowLastColumn="0" w:lastRowFirstColumn="0" w:lastRowLastColumn="0"/>
               <w:rPr>
                 <w:rFonts w:ascii="Times New Roman" w:eastAsia="Times New Roman" w:hAnsi="Times New Roman" w:cs="Times New Roman"/>
-                <w:sz w:val="24"/>
-                <w:szCs w:val="24"/>
-              </w:rPr>
-            </w:pPr>
-            <w:proofErr w:type="spellStart"/>
-            <w:r>
-              <w:rPr>
-                <w:rFonts w:ascii="Times New Roman" w:eastAsia="Times New Roman" w:hAnsi="Times New Roman" w:cs="Times New Roman"/>
-                <w:sz w:val="24"/>
-                <w:szCs w:val="24"/>
-              </w:rPr>
-              <w:t>En</w:t>
-            </w:r>
-            <w:proofErr w:type="spellEnd"/>
-            <w:r>
-              <w:rPr>
-                <w:rFonts w:ascii="Times New Roman" w:eastAsia="Times New Roman" w:hAnsi="Times New Roman" w:cs="Times New Roman"/>
-                <w:sz w:val="24"/>
-                <w:szCs w:val="24"/>
-              </w:rPr>
-              <w:t xml:space="preserve"> </w:t>
-            </w:r>
-            <w:r>
-              <w:rPr>
-                <w:rFonts w:ascii="Courier New" w:eastAsia="Times New Roman" w:hAnsi="Courier New" w:cs="Courier New"/>
-                <w:sz w:val="20"/>
-                <w:szCs w:val="20"/>
-              </w:rPr>
-              <w:t>views.py</w:t>
-            </w:r>
-          </w:p>
-        </w:tc>
-        <w:tc>
-          <w:tcPr>
-            <w:tcW w:w="0" w:type="auto"/>
-            <w:hideMark/>
-          </w:tcPr>
-          <w:p>
-            <w:pPr>
-              <w:cnfStyle w:val="000000000000" w:firstRow="0" w:lastRow="0" w:firstColumn="0" w:lastColumn="0" w:oddVBand="0" w:evenVBand="0" w:oddHBand="0" w:evenHBand="0" w:firstRowFirstColumn="0" w:firstRowLastColumn="0" w:lastRowFirstColumn="0" w:lastRowLastColumn="0"/>
-              <w:rPr>
-                <w:rFonts w:ascii="Times New Roman" w:eastAsia="Times New Roman" w:hAnsi="Times New Roman" w:cs="Times New Roman"/>
-                <w:sz w:val="24"/>
-                <w:szCs w:val="24"/>
-              </w:rPr>
-            </w:pPr>
-            <w:r>
-              <w:rPr>
-                <w:rFonts w:ascii="Courier New" w:eastAsia="Times New Roman" w:hAnsi="Courier New" w:cs="Courier New"/>
-                <w:sz w:val="20"/>
-                <w:szCs w:val="20"/>
-              </w:rPr>
-              <w:t xml:space="preserve">return </w:t>
-            </w:r>
-            <w:proofErr w:type="spellStart"/>
-            <w:r>
-              <w:rPr>
-                <w:rFonts w:ascii="Courier New" w:eastAsia="Times New Roman" w:hAnsi="Courier New" w:cs="Courier New"/>
-                <w:sz w:val="20"/>
-                <w:szCs w:val="20"/>
-              </w:rPr>
-              <w:t>HttpResponse</w:t>
-            </w:r>
-            <w:proofErr w:type="spellEnd"/>
-            <w:r>
-              <w:rPr>
-                <w:rFonts w:ascii="Courier New" w:eastAsia="Times New Roman" w:hAnsi="Courier New" w:cs="Courier New"/>
-                <w:sz w:val="20"/>
-                <w:szCs w:val="20"/>
-              </w:rPr>
-              <w:t>("</w:t>
-            </w:r>
-            <w:proofErr w:type="spellStart"/>
-            <w:r>
-              <w:rPr>
-                <w:rFonts w:ascii="Courier New" w:eastAsia="Times New Roman" w:hAnsi="Courier New" w:cs="Courier New"/>
-                <w:sz w:val="20"/>
-                <w:szCs w:val="20"/>
-              </w:rPr>
-              <w:t>Hola</w:t>
-            </w:r>
-            <w:proofErr w:type="spellEnd"/>
-            <w:r>
-              <w:rPr>
-                <w:rFonts w:ascii="Courier New" w:eastAsia="Times New Roman" w:hAnsi="Courier New" w:cs="Courier New"/>
-                <w:sz w:val="20"/>
-                <w:szCs w:val="20"/>
-              </w:rPr>
-              <w:t xml:space="preserve"> </w:t>
-            </w:r>
-            <w:proofErr w:type="spellStart"/>
-            <w:r>
-              <w:rPr>
-                <w:rFonts w:ascii="Courier New" w:eastAsia="Times New Roman" w:hAnsi="Courier New" w:cs="Courier New"/>
-                <w:sz w:val="20"/>
-                <w:szCs w:val="20"/>
-              </w:rPr>
-              <w:t>mundo</w:t>
-            </w:r>
-            <w:proofErr w:type="spellEnd"/>
-            <w:r>
-              <w:rPr>
-                <w:rFonts w:ascii="Courier New" w:eastAsia="Times New Roman" w:hAnsi="Courier New" w:cs="Courier New"/>
-                <w:sz w:val="20"/>
-                <w:szCs w:val="20"/>
-              </w:rPr>
-              <w:t>")</w:t>
+                <w:color w:val="FF0000"/>
+                <w:sz w:val="24"/>
+                <w:szCs w:val="24"/>
+              </w:rPr>
+            </w:pPr>
+            <w:r>
+              <w:rPr>
+                <w:rFonts w:ascii="Courier New" w:eastAsia="Times New Roman" w:hAnsi="Courier New" w:cs="Courier New"/>
+                <w:color w:val="FF0000"/>
+                <w:sz w:val="20"/>
+                <w:szCs w:val="20"/>
+              </w:rPr>
+              <w:t>path('', include('</w:t>
+            </w:r>
+            <w:proofErr w:type="spellStart"/>
+            <w:r>
+              <w:rPr>
+                <w:rFonts w:ascii="Courier New" w:eastAsia="Times New Roman" w:hAnsi="Courier New" w:cs="Courier New"/>
+                <w:color w:val="FF0000"/>
+                <w:sz w:val="20"/>
+                <w:szCs w:val="20"/>
+              </w:rPr>
+              <w:t>producto.urls</w:t>
+            </w:r>
+            <w:proofErr w:type="spellEnd"/>
+            <w:r>
+              <w:rPr>
+                <w:rFonts w:ascii="Courier New" w:eastAsia="Times New Roman" w:hAnsi="Courier New" w:cs="Courier New"/>
+                <w:color w:val="FF0000"/>
+                <w:sz w:val="20"/>
+                <w:szCs w:val="20"/>
+              </w:rPr>
+              <w:t>'))</w:t>
             </w:r>
           </w:p>
         </w:tc>
@@ -1409,15 +1591,18 @@
                 <w:rFonts w:ascii="Times New Roman" w:eastAsia="Times New Roman" w:hAnsi="Times New Roman" w:cs="Times New Roman"/>
                 <w:sz w:val="24"/>
                 <w:szCs w:val="24"/>
-              </w:rPr>
-            </w:pPr>
-            <w:r>
-              <w:rPr>
-                <w:rFonts w:ascii="Courier New" w:eastAsia="Times New Roman" w:hAnsi="Courier New" w:cs="Courier New"/>
-                <w:sz w:val="20"/>
-                <w:szCs w:val="20"/>
-              </w:rPr>
-              <w:t>migrate</w:t>
+                <w:lang w:val="es-AR"/>
+              </w:rPr>
+            </w:pPr>
+            <w:r>
+              <w:rPr>
+                <w:rFonts w:ascii="Courier New" w:eastAsia="Times New Roman" w:hAnsi="Courier New" w:cs="Courier New"/>
+                <w:sz w:val="20"/>
+                <w:szCs w:val="20"/>
+                <w:lang w:val="es-AR"/>
+              </w:rPr>
+              <w:lastRenderedPageBreak/>
+              <w:t>views.py</w:t>
             </w:r>
           </w:p>
         </w:tc>
@@ -1443,7 +1628,7 @@
                 <w:szCs w:val="24"/>
                 <w:lang w:val="es-AR"/>
               </w:rPr>
-              <w:t>Aplica los cambios al modelo en la base de datos</w:t>
+              <w:t>Archivo donde se definen funciones que responden a las peticiones HTTP</w:t>
             </w:r>
           </w:p>
         </w:tc>
@@ -1468,16 +1653,34 @@
                 <w:sz w:val="24"/>
                 <w:szCs w:val="24"/>
               </w:rPr>
-              <w:t>En</w:t>
-            </w:r>
-            <w:proofErr w:type="spellEnd"/>
-            <w:r>
-              <w:rPr>
-                <w:rFonts w:ascii="Times New Roman" w:eastAsia="Times New Roman" w:hAnsi="Times New Roman" w:cs="Times New Roman"/>
-                <w:sz w:val="24"/>
-                <w:szCs w:val="24"/>
-              </w:rPr>
-              <w:t xml:space="preserve"> la terminal</w:t>
+              <w:t>Dentro</w:t>
+            </w:r>
+            <w:proofErr w:type="spellEnd"/>
+            <w:r>
+              <w:rPr>
+                <w:rFonts w:ascii="Times New Roman" w:eastAsia="Times New Roman" w:hAnsi="Times New Roman" w:cs="Times New Roman"/>
+                <w:sz w:val="24"/>
+                <w:szCs w:val="24"/>
+              </w:rPr>
+              <w:t xml:space="preserve"> de </w:t>
+            </w:r>
+            <w:proofErr w:type="spellStart"/>
+            <w:r>
+              <w:rPr>
+                <w:rFonts w:ascii="Times New Roman" w:eastAsia="Times New Roman" w:hAnsi="Times New Roman" w:cs="Times New Roman"/>
+                <w:sz w:val="24"/>
+                <w:szCs w:val="24"/>
+              </w:rPr>
+              <w:t>cada</w:t>
+            </w:r>
+            <w:proofErr w:type="spellEnd"/>
+            <w:r>
+              <w:rPr>
+                <w:rFonts w:ascii="Times New Roman" w:eastAsia="Times New Roman" w:hAnsi="Times New Roman" w:cs="Times New Roman"/>
+                <w:sz w:val="24"/>
+                <w:szCs w:val="24"/>
+              </w:rPr>
+              <w:t xml:space="preserve"> app</w:t>
             </w:r>
           </w:p>
         </w:tc>
@@ -1495,13 +1698,41 @@
                 <w:szCs w:val="24"/>
               </w:rPr>
             </w:pPr>
-            <w:r>
-              <w:rPr>
-                <w:rFonts w:ascii="Courier New" w:eastAsia="Times New Roman" w:hAnsi="Courier New" w:cs="Courier New"/>
-                <w:sz w:val="20"/>
-                <w:szCs w:val="20"/>
-              </w:rPr>
-              <w:t>python manage.py migrate</w:t>
+            <w:proofErr w:type="spellStart"/>
+            <w:r>
+              <w:rPr>
+                <w:rFonts w:ascii="Courier New" w:eastAsia="Times New Roman" w:hAnsi="Courier New" w:cs="Courier New"/>
+                <w:sz w:val="20"/>
+                <w:szCs w:val="20"/>
+              </w:rPr>
+              <w:t>def</w:t>
+            </w:r>
+            <w:proofErr w:type="spellEnd"/>
+            <w:r>
+              <w:rPr>
+                <w:rFonts w:ascii="Courier New" w:eastAsia="Times New Roman" w:hAnsi="Courier New" w:cs="Courier New"/>
+                <w:sz w:val="20"/>
+                <w:szCs w:val="20"/>
+              </w:rPr>
+              <w:t xml:space="preserve"> index(request): return </w:t>
+            </w:r>
+            <w:proofErr w:type="spellStart"/>
+            <w:r>
+              <w:rPr>
+                <w:rFonts w:ascii="Courier New" w:eastAsia="Times New Roman" w:hAnsi="Courier New" w:cs="Courier New"/>
+                <w:sz w:val="20"/>
+                <w:szCs w:val="20"/>
+              </w:rPr>
+              <w:t>HttpResponse</w:t>
+            </w:r>
+            <w:proofErr w:type="spellEnd"/>
+            <w:r>
+              <w:rPr>
+                <w:rFonts w:ascii="Courier New" w:eastAsia="Times New Roman" w:hAnsi="Courier New" w:cs="Courier New"/>
+                <w:sz w:val="20"/>
+                <w:szCs w:val="20"/>
+              </w:rPr>
+              <w:t>(...)</w:t>
             </w:r>
           </w:p>
         </w:tc>
@@ -1511,120 +1742,96 @@
           <w:tcPr>
             <w:cnfStyle w:val="001000000000" w:firstRow="0" w:lastRow="0" w:firstColumn="1" w:lastColumn="0" w:oddVBand="0" w:evenVBand="0" w:oddHBand="0" w:evenHBand="0" w:firstRowFirstColumn="0" w:firstRowLastColumn="0" w:lastRowFirstColumn="0" w:lastRowLastColumn="0"/>
             <w:tcW w:w="0" w:type="auto"/>
-            <w:hideMark/>
-          </w:tcPr>
-          <w:p>
-            <w:pPr>
-              <w:rPr>
-                <w:rFonts w:ascii="Times New Roman" w:eastAsia="Times New Roman" w:hAnsi="Times New Roman" w:cs="Times New Roman"/>
-                <w:sz w:val="24"/>
-                <w:szCs w:val="24"/>
-              </w:rPr>
-            </w:pPr>
-            <w:proofErr w:type="spellStart"/>
-            <w:r>
-              <w:rPr>
-                <w:rFonts w:ascii="Courier New" w:eastAsia="Times New Roman" w:hAnsi="Courier New" w:cs="Courier New"/>
-                <w:sz w:val="20"/>
-                <w:szCs w:val="20"/>
-              </w:rPr>
-              <w:t>makemigrations</w:t>
-            </w:r>
-            <w:proofErr w:type="spellEnd"/>
-          </w:p>
-        </w:tc>
-        <w:tc>
-          <w:tcPr>
-            <w:tcW w:w="0" w:type="auto"/>
-            <w:hideMark/>
+          </w:tcPr>
+          <w:p>
+            <w:pPr>
+              <w:rPr>
+                <w:rFonts w:ascii="Times New Roman" w:eastAsia="Times New Roman" w:hAnsi="Times New Roman" w:cs="Times New Roman"/>
+                <w:color w:val="FF0000"/>
+                <w:sz w:val="24"/>
+                <w:szCs w:val="24"/>
+              </w:rPr>
+            </w:pPr>
+            <w:r>
+              <w:rPr>
+                <w:rFonts w:ascii="Courier New" w:eastAsia="Times New Roman" w:hAnsi="Courier New" w:cs="Courier New"/>
+                <w:sz w:val="20"/>
+                <w:szCs w:val="20"/>
+              </w:rPr>
+              <w:t xml:space="preserve">python manage.py </w:t>
+            </w:r>
+            <w:proofErr w:type="spellStart"/>
+            <w:r>
+              <w:rPr>
+                <w:rFonts w:ascii="Courier New" w:eastAsia="Times New Roman" w:hAnsi="Courier New" w:cs="Courier New"/>
+                <w:sz w:val="20"/>
+                <w:szCs w:val="20"/>
+              </w:rPr>
+              <w:t>runserver</w:t>
+            </w:r>
+            <w:proofErr w:type="spellEnd"/>
+          </w:p>
+        </w:tc>
+        <w:tc>
+          <w:tcPr>
+            <w:tcW w:w="0" w:type="auto"/>
           </w:tcPr>
           <w:p>
             <w:pPr>
               <w:cnfStyle w:val="000000000000" w:firstRow="0" w:lastRow="0" w:firstColumn="0" w:lastColumn="0" w:oddVBand="0" w:evenVBand="0" w:oddHBand="0" w:evenHBand="0" w:firstRowFirstColumn="0" w:firstRowLastColumn="0" w:lastRowFirstColumn="0" w:lastRowLastColumn="0"/>
               <w:rPr>
                 <w:rFonts w:ascii="Times New Roman" w:eastAsia="Times New Roman" w:hAnsi="Times New Roman" w:cs="Times New Roman"/>
-                <w:sz w:val="24"/>
-                <w:szCs w:val="24"/>
-                <w:lang w:val="es-AR"/>
-              </w:rPr>
-            </w:pPr>
-            <w:r>
-              <w:rPr>
-                <w:rFonts w:ascii="Times New Roman" w:eastAsia="Times New Roman" w:hAnsi="Times New Roman" w:cs="Times New Roman"/>
-                <w:sz w:val="24"/>
-                <w:szCs w:val="24"/>
-                <w:lang w:val="es-AR"/>
-              </w:rPr>
-              <w:t>Crea los archivos de migración a partir de cambios en los modelos</w:t>
-            </w:r>
-          </w:p>
-        </w:tc>
-        <w:tc>
-          <w:tcPr>
-            <w:tcW w:w="0" w:type="auto"/>
-            <w:hideMark/>
+                <w:color w:val="FF0000"/>
+                <w:sz w:val="24"/>
+                <w:szCs w:val="24"/>
+                <w:lang w:val="es-AR"/>
+              </w:rPr>
+            </w:pPr>
+            <w:r>
+              <w:rPr>
+                <w:rFonts w:ascii="Times New Roman" w:eastAsia="Times New Roman" w:hAnsi="Times New Roman" w:cs="Times New Roman"/>
+                <w:color w:val="FF0000"/>
+                <w:sz w:val="24"/>
+                <w:szCs w:val="24"/>
+                <w:lang w:val="es-AR"/>
+              </w:rPr>
+              <w:t>Ingresa al servidor</w:t>
+            </w:r>
+            <w:bookmarkStart w:id="0" w:name="_GoBack"/>
+            <w:bookmarkEnd w:id="0"/>
+          </w:p>
+        </w:tc>
+        <w:tc>
+          <w:tcPr>
+            <w:tcW w:w="0" w:type="auto"/>
           </w:tcPr>
           <w:p>
             <w:pPr>
               <w:cnfStyle w:val="000000000000" w:firstRow="0" w:lastRow="0" w:firstColumn="0" w:lastColumn="0" w:oddVBand="0" w:evenVBand="0" w:oddHBand="0" w:evenHBand="0" w:firstRowFirstColumn="0" w:firstRowLastColumn="0" w:lastRowFirstColumn="0" w:lastRowLastColumn="0"/>
               <w:rPr>
                 <w:rFonts w:ascii="Times New Roman" w:eastAsia="Times New Roman" w:hAnsi="Times New Roman" w:cs="Times New Roman"/>
-                <w:sz w:val="24"/>
-                <w:szCs w:val="24"/>
-              </w:rPr>
-            </w:pPr>
-            <w:proofErr w:type="spellStart"/>
-            <w:r>
-              <w:rPr>
-                <w:rFonts w:ascii="Times New Roman" w:eastAsia="Times New Roman" w:hAnsi="Times New Roman" w:cs="Times New Roman"/>
-                <w:sz w:val="24"/>
-                <w:szCs w:val="24"/>
-              </w:rPr>
-              <w:t>En</w:t>
-            </w:r>
-            <w:proofErr w:type="spellEnd"/>
-            <w:r>
-              <w:rPr>
-                <w:rFonts w:ascii="Times New Roman" w:eastAsia="Times New Roman" w:hAnsi="Times New Roman" w:cs="Times New Roman"/>
-                <w:sz w:val="24"/>
-                <w:szCs w:val="24"/>
-              </w:rPr>
-              <w:t xml:space="preserve"> la terminal</w:t>
-            </w:r>
-          </w:p>
-        </w:tc>
-        <w:tc>
-          <w:tcPr>
-            <w:tcW w:w="0" w:type="auto"/>
-            <w:hideMark/>
+                <w:color w:val="FF0000"/>
+                <w:sz w:val="24"/>
+                <w:szCs w:val="24"/>
+                <w:lang w:val="es-AR"/>
+              </w:rPr>
+            </w:pPr>
+          </w:p>
+        </w:tc>
+        <w:tc>
+          <w:tcPr>
+            <w:tcW w:w="0" w:type="auto"/>
           </w:tcPr>
           <w:p>
             <w:pPr>
               <w:cnfStyle w:val="000000000000" w:firstRow="0" w:lastRow="0" w:firstColumn="0" w:lastColumn="0" w:oddVBand="0" w:evenVBand="0" w:oddHBand="0" w:evenHBand="0" w:firstRowFirstColumn="0" w:firstRowLastColumn="0" w:lastRowFirstColumn="0" w:lastRowLastColumn="0"/>
               <w:rPr>
                 <w:rFonts w:ascii="Times New Roman" w:eastAsia="Times New Roman" w:hAnsi="Times New Roman" w:cs="Times New Roman"/>
-                <w:sz w:val="24"/>
-                <w:szCs w:val="24"/>
-              </w:rPr>
-            </w:pPr>
-            <w:r>
-              <w:rPr>
-                <w:rFonts w:ascii="Courier New" w:eastAsia="Times New Roman" w:hAnsi="Courier New" w:cs="Courier New"/>
-                <w:sz w:val="20"/>
-                <w:szCs w:val="20"/>
-              </w:rPr>
-              <w:t xml:space="preserve">python manage.py </w:t>
-            </w:r>
-            <w:proofErr w:type="spellStart"/>
-            <w:r>
-              <w:rPr>
-                <w:rFonts w:ascii="Courier New" w:eastAsia="Times New Roman" w:hAnsi="Courier New" w:cs="Courier New"/>
-                <w:sz w:val="20"/>
-                <w:szCs w:val="20"/>
-              </w:rPr>
-              <w:t>makemigrations</w:t>
-            </w:r>
-            <w:proofErr w:type="spellEnd"/>
+                <w:color w:val="FF0000"/>
+                <w:sz w:val="24"/>
+                <w:szCs w:val="24"/>
+              </w:rPr>
+            </w:pPr>
           </w:p>
         </w:tc>
       </w:tr>
@@ -1636,32 +1843,20 @@
           <w:tcPr>
             <w:cnfStyle w:val="001000000000" w:firstRow="0" w:lastRow="0" w:firstColumn="1" w:lastColumn="0" w:oddVBand="0" w:evenVBand="0" w:oddHBand="0" w:evenHBand="0" w:firstRowFirstColumn="0" w:firstRowLastColumn="0" w:lastRowFirstColumn="0" w:lastRowLastColumn="0"/>
             <w:tcW w:w="0" w:type="auto"/>
-            <w:hideMark/>
-          </w:tcPr>
-          <w:p>
-            <w:pPr>
-              <w:rPr>
-                <w:rFonts w:ascii="Times New Roman" w:eastAsia="Times New Roman" w:hAnsi="Times New Roman" w:cs="Times New Roman"/>
-                <w:sz w:val="24"/>
-                <w:szCs w:val="24"/>
-              </w:rPr>
-            </w:pPr>
-            <w:proofErr w:type="spellStart"/>
-            <w:r>
-              <w:rPr>
-                <w:rFonts w:ascii="Courier New" w:eastAsia="Times New Roman" w:hAnsi="Courier New" w:cs="Courier New"/>
-                <w:sz w:val="20"/>
-                <w:szCs w:val="20"/>
-              </w:rPr>
-              <w:t>models.Model</w:t>
-            </w:r>
-            <w:proofErr w:type="spellEnd"/>
-          </w:p>
-        </w:tc>
-        <w:tc>
-          <w:tcPr>
-            <w:tcW w:w="0" w:type="auto"/>
-            <w:hideMark/>
+          </w:tcPr>
+          <w:p>
+            <w:pPr>
+              <w:rPr>
+                <w:rFonts w:ascii="Times New Roman" w:eastAsia="Times New Roman" w:hAnsi="Times New Roman" w:cs="Times New Roman"/>
+                <w:sz w:val="24"/>
+                <w:szCs w:val="24"/>
+              </w:rPr>
+            </w:pPr>
+          </w:p>
+        </w:tc>
+        <w:tc>
+          <w:tcPr>
+            <w:tcW w:w="0" w:type="auto"/>
           </w:tcPr>
           <w:p>
             <w:pPr>
@@ -1673,21 +1868,11 @@
                 <w:lang w:val="es-AR"/>
               </w:rPr>
             </w:pPr>
-            <w:r>
-              <w:rPr>
-                <w:rFonts w:ascii="Times New Roman" w:eastAsia="Times New Roman" w:hAnsi="Times New Roman" w:cs="Times New Roman"/>
-                <w:sz w:val="24"/>
-                <w:szCs w:val="24"/>
-                <w:lang w:val="es-AR"/>
-              </w:rPr>
-              <w:t>Clase base para definir tablas de la base de datos</w:t>
-            </w:r>
-          </w:p>
-        </w:tc>
-        <w:tc>
-          <w:tcPr>
-            <w:tcW w:w="0" w:type="auto"/>
-            <w:hideMark/>
+          </w:p>
+        </w:tc>
+        <w:tc>
+          <w:tcPr>
+            <w:tcW w:w="0" w:type="auto"/>
           </w:tcPr>
           <w:p>
             <w:pPr>
@@ -1696,42 +1881,13 @@
                 <w:rFonts w:ascii="Times New Roman" w:eastAsia="Times New Roman" w:hAnsi="Times New Roman" w:cs="Times New Roman"/>
                 <w:sz w:val="24"/>
                 <w:szCs w:val="24"/>
-                <w:lang w:val="es-AR"/>
-              </w:rPr>
-            </w:pPr>
-            <w:r>
-              <w:rPr>
-                <w:rFonts w:ascii="Times New Roman" w:eastAsia="Times New Roman" w:hAnsi="Times New Roman" w:cs="Times New Roman"/>
-                <w:sz w:val="24"/>
-                <w:szCs w:val="24"/>
-                <w:lang w:val="es-AR"/>
-              </w:rPr>
-              <w:t xml:space="preserve">En </w:t>
-            </w:r>
-            <w:r>
-              <w:rPr>
-                <w:rFonts w:ascii="Courier New" w:eastAsia="Times New Roman" w:hAnsi="Courier New" w:cs="Courier New"/>
-                <w:sz w:val="20"/>
-                <w:szCs w:val="20"/>
-                <w:lang w:val="es-AR"/>
-              </w:rPr>
-              <w:t>models.py</w:t>
-            </w:r>
-            <w:r>
-              <w:rPr>
-                <w:rFonts w:ascii="Times New Roman" w:eastAsia="Times New Roman" w:hAnsi="Times New Roman" w:cs="Times New Roman"/>
-                <w:sz w:val="24"/>
-                <w:szCs w:val="24"/>
-                <w:lang w:val="es-AR"/>
-              </w:rPr>
-              <w:t xml:space="preserve"> de cada app</w:t>
-            </w:r>
-          </w:p>
-        </w:tc>
-        <w:tc>
-          <w:tcPr>
-            <w:tcW w:w="0" w:type="auto"/>
-            <w:hideMark/>
+              </w:rPr>
+            </w:pPr>
+          </w:p>
+        </w:tc>
+        <w:tc>
+          <w:tcPr>
+            <w:tcW w:w="0" w:type="auto"/>
           </w:tcPr>
           <w:p>
             <w:pPr>
@@ -1742,50 +1898,6 @@
                 <w:szCs w:val="24"/>
               </w:rPr>
             </w:pPr>
-            <w:r>
-              <w:rPr>
-                <w:rFonts w:ascii="Courier New" w:eastAsia="Times New Roman" w:hAnsi="Courier New" w:cs="Courier New"/>
-                <w:sz w:val="20"/>
-                <w:szCs w:val="20"/>
-              </w:rPr>
-              <w:t xml:space="preserve">class </w:t>
-            </w:r>
-            <w:proofErr w:type="spellStart"/>
-            <w:r>
-              <w:rPr>
-                <w:rFonts w:ascii="Courier New" w:eastAsia="Times New Roman" w:hAnsi="Courier New" w:cs="Courier New"/>
-                <w:sz w:val="20"/>
-                <w:szCs w:val="20"/>
-              </w:rPr>
-              <w:t>Producto</w:t>
-            </w:r>
-            <w:proofErr w:type="spellEnd"/>
-            <w:r>
-              <w:rPr>
-                <w:rFonts w:ascii="Courier New" w:eastAsia="Times New Roman" w:hAnsi="Courier New" w:cs="Courier New"/>
-                <w:sz w:val="20"/>
-                <w:szCs w:val="20"/>
-              </w:rPr>
-              <w:t>(</w:t>
-            </w:r>
-            <w:proofErr w:type="spellStart"/>
-            <w:r>
-              <w:rPr>
-                <w:rFonts w:ascii="Courier New" w:eastAsia="Times New Roman" w:hAnsi="Courier New" w:cs="Courier New"/>
-                <w:sz w:val="20"/>
-                <w:szCs w:val="20"/>
-              </w:rPr>
-              <w:t>models.Model</w:t>
-            </w:r>
-            <w:proofErr w:type="spellEnd"/>
-            <w:r>
-              <w:rPr>
-                <w:rFonts w:ascii="Courier New" w:eastAsia="Times New Roman" w:hAnsi="Courier New" w:cs="Courier New"/>
-                <w:sz w:val="20"/>
-                <w:szCs w:val="20"/>
-              </w:rPr>
-              <w:t>):</w:t>
-            </w:r>
           </w:p>
         </w:tc>
       </w:tr>
@@ -1794,6 +1906,76 @@
           <w:tcPr>
             <w:cnfStyle w:val="001000000000" w:firstRow="0" w:lastRow="0" w:firstColumn="1" w:lastColumn="0" w:oddVBand="0" w:evenVBand="0" w:oddHBand="0" w:evenHBand="0" w:firstRowFirstColumn="0" w:firstRowLastColumn="0" w:lastRowFirstColumn="0" w:lastRowLastColumn="0"/>
             <w:tcW w:w="0" w:type="auto"/>
+          </w:tcPr>
+          <w:p>
+            <w:pPr>
+              <w:rPr>
+                <w:rFonts w:ascii="Times New Roman" w:eastAsia="Times New Roman" w:hAnsi="Times New Roman" w:cs="Times New Roman"/>
+                <w:color w:val="FF0000"/>
+                <w:sz w:val="24"/>
+                <w:szCs w:val="24"/>
+              </w:rPr>
+            </w:pPr>
+          </w:p>
+        </w:tc>
+        <w:tc>
+          <w:tcPr>
+            <w:tcW w:w="0" w:type="auto"/>
+          </w:tcPr>
+          <w:p>
+            <w:pPr>
+              <w:cnfStyle w:val="000000000000" w:firstRow="0" w:lastRow="0" w:firstColumn="0" w:lastColumn="0" w:oddVBand="0" w:evenVBand="0" w:oddHBand="0" w:evenHBand="0" w:firstRowFirstColumn="0" w:firstRowLastColumn="0" w:lastRowFirstColumn="0" w:lastRowLastColumn="0"/>
+              <w:rPr>
+                <w:rFonts w:ascii="Times New Roman" w:eastAsia="Times New Roman" w:hAnsi="Times New Roman" w:cs="Times New Roman"/>
+                <w:color w:val="FF0000"/>
+                <w:sz w:val="24"/>
+                <w:szCs w:val="24"/>
+                <w:lang w:val="es-AR"/>
+              </w:rPr>
+            </w:pPr>
+          </w:p>
+        </w:tc>
+        <w:tc>
+          <w:tcPr>
+            <w:tcW w:w="0" w:type="auto"/>
+          </w:tcPr>
+          <w:p>
+            <w:pPr>
+              <w:cnfStyle w:val="000000000000" w:firstRow="0" w:lastRow="0" w:firstColumn="0" w:lastColumn="0" w:oddVBand="0" w:evenVBand="0" w:oddHBand="0" w:evenHBand="0" w:firstRowFirstColumn="0" w:firstRowLastColumn="0" w:lastRowFirstColumn="0" w:lastRowLastColumn="0"/>
+              <w:rPr>
+                <w:rFonts w:ascii="Times New Roman" w:eastAsia="Times New Roman" w:hAnsi="Times New Roman" w:cs="Times New Roman"/>
+                <w:color w:val="FF0000"/>
+                <w:sz w:val="24"/>
+                <w:szCs w:val="24"/>
+              </w:rPr>
+            </w:pPr>
+          </w:p>
+        </w:tc>
+        <w:tc>
+          <w:tcPr>
+            <w:tcW w:w="0" w:type="auto"/>
+          </w:tcPr>
+          <w:p>
+            <w:pPr>
+              <w:cnfStyle w:val="000000000000" w:firstRow="0" w:lastRow="0" w:firstColumn="0" w:lastColumn="0" w:oddVBand="0" w:evenVBand="0" w:oddHBand="0" w:evenHBand="0" w:firstRowFirstColumn="0" w:firstRowLastColumn="0" w:lastRowFirstColumn="0" w:lastRowLastColumn="0"/>
+              <w:rPr>
+                <w:rFonts w:ascii="Times New Roman" w:eastAsia="Times New Roman" w:hAnsi="Times New Roman" w:cs="Times New Roman"/>
+                <w:color w:val="FF0000"/>
+                <w:sz w:val="24"/>
+                <w:szCs w:val="24"/>
+              </w:rPr>
+            </w:pPr>
+          </w:p>
+        </w:tc>
+      </w:tr>
+      <w:tr>
+        <w:trPr>
+          <w:cnfStyle w:val="000000100000" w:firstRow="0" w:lastRow="0" w:firstColumn="0" w:lastColumn="0" w:oddVBand="0" w:evenVBand="0" w:oddHBand="1" w:evenHBand="0" w:firstRowFirstColumn="0" w:firstRowLastColumn="0" w:lastRowFirstColumn="0" w:lastRowLastColumn="0"/>
+        </w:trPr>
+        <w:tc>
+          <w:tcPr>
+            <w:cnfStyle w:val="001000000000" w:firstRow="0" w:lastRow="0" w:firstColumn="1" w:lastColumn="0" w:oddVBand="0" w:evenVBand="0" w:oddHBand="0" w:evenHBand="0" w:firstRowFirstColumn="0" w:firstRowLastColumn="0" w:lastRowFirstColumn="0" w:lastRowLastColumn="0"/>
+            <w:tcW w:w="0" w:type="auto"/>
             <w:hideMark/>
           </w:tcPr>
           <w:p>
@@ -1810,7 +1992,7 @@
                 <w:sz w:val="20"/>
                 <w:szCs w:val="20"/>
               </w:rPr>
-              <w:t>path()</w:t>
+              <w:t>migrate</w:t>
             </w:r>
           </w:p>
         </w:tc>
@@ -1821,6 +2003,118 @@
           </w:tcPr>
           <w:p>
             <w:pPr>
+              <w:cnfStyle w:val="000000100000" w:firstRow="0" w:lastRow="0" w:firstColumn="0" w:lastColumn="0" w:oddVBand="0" w:evenVBand="0" w:oddHBand="1" w:evenHBand="0" w:firstRowFirstColumn="0" w:firstRowLastColumn="0" w:lastRowFirstColumn="0" w:lastRowLastColumn="0"/>
+              <w:rPr>
+                <w:rFonts w:ascii="Times New Roman" w:eastAsia="Times New Roman" w:hAnsi="Times New Roman" w:cs="Times New Roman"/>
+                <w:sz w:val="24"/>
+                <w:szCs w:val="24"/>
+                <w:lang w:val="es-AR"/>
+              </w:rPr>
+            </w:pPr>
+            <w:r>
+              <w:rPr>
+                <w:rFonts w:ascii="Times New Roman" w:eastAsia="Times New Roman" w:hAnsi="Times New Roman" w:cs="Times New Roman"/>
+                <w:sz w:val="24"/>
+                <w:szCs w:val="24"/>
+                <w:lang w:val="es-AR"/>
+              </w:rPr>
+              <w:t>Aplica los cambios al modelo en la base de datos</w:t>
+            </w:r>
+          </w:p>
+        </w:tc>
+        <w:tc>
+          <w:tcPr>
+            <w:tcW w:w="0" w:type="auto"/>
+            <w:hideMark/>
+          </w:tcPr>
+          <w:p>
+            <w:pPr>
+              <w:cnfStyle w:val="000000100000" w:firstRow="0" w:lastRow="0" w:firstColumn="0" w:lastColumn="0" w:oddVBand="0" w:evenVBand="0" w:oddHBand="1" w:evenHBand="0" w:firstRowFirstColumn="0" w:firstRowLastColumn="0" w:lastRowFirstColumn="0" w:lastRowLastColumn="0"/>
+              <w:rPr>
+                <w:rFonts w:ascii="Times New Roman" w:eastAsia="Times New Roman" w:hAnsi="Times New Roman" w:cs="Times New Roman"/>
+                <w:sz w:val="24"/>
+                <w:szCs w:val="24"/>
+              </w:rPr>
+            </w:pPr>
+            <w:proofErr w:type="spellStart"/>
+            <w:r>
+              <w:rPr>
+                <w:rFonts w:ascii="Times New Roman" w:eastAsia="Times New Roman" w:hAnsi="Times New Roman" w:cs="Times New Roman"/>
+                <w:sz w:val="24"/>
+                <w:szCs w:val="24"/>
+              </w:rPr>
+              <w:t>En</w:t>
+            </w:r>
+            <w:proofErr w:type="spellEnd"/>
+            <w:r>
+              <w:rPr>
+                <w:rFonts w:ascii="Times New Roman" w:eastAsia="Times New Roman" w:hAnsi="Times New Roman" w:cs="Times New Roman"/>
+                <w:sz w:val="24"/>
+                <w:szCs w:val="24"/>
+              </w:rPr>
+              <w:t xml:space="preserve"> la terminal</w:t>
+            </w:r>
+          </w:p>
+        </w:tc>
+        <w:tc>
+          <w:tcPr>
+            <w:tcW w:w="0" w:type="auto"/>
+            <w:hideMark/>
+          </w:tcPr>
+          <w:p>
+            <w:pPr>
+              <w:cnfStyle w:val="000000100000" w:firstRow="0" w:lastRow="0" w:firstColumn="0" w:lastColumn="0" w:oddVBand="0" w:evenVBand="0" w:oddHBand="1" w:evenHBand="0" w:firstRowFirstColumn="0" w:firstRowLastColumn="0" w:lastRowFirstColumn="0" w:lastRowLastColumn="0"/>
+              <w:rPr>
+                <w:rFonts w:ascii="Times New Roman" w:eastAsia="Times New Roman" w:hAnsi="Times New Roman" w:cs="Times New Roman"/>
+                <w:sz w:val="24"/>
+                <w:szCs w:val="24"/>
+              </w:rPr>
+            </w:pPr>
+            <w:r>
+              <w:rPr>
+                <w:rFonts w:ascii="Courier New" w:eastAsia="Times New Roman" w:hAnsi="Courier New" w:cs="Courier New"/>
+                <w:sz w:val="20"/>
+                <w:szCs w:val="20"/>
+              </w:rPr>
+              <w:t>python manage.py migrate</w:t>
+            </w:r>
+          </w:p>
+        </w:tc>
+      </w:tr>
+      <w:tr>
+        <w:tc>
+          <w:tcPr>
+            <w:cnfStyle w:val="001000000000" w:firstRow="0" w:lastRow="0" w:firstColumn="1" w:lastColumn="0" w:oddVBand="0" w:evenVBand="0" w:oddHBand="0" w:evenHBand="0" w:firstRowFirstColumn="0" w:firstRowLastColumn="0" w:lastRowFirstColumn="0" w:lastRowLastColumn="0"/>
+            <w:tcW w:w="0" w:type="auto"/>
+            <w:hideMark/>
+          </w:tcPr>
+          <w:p>
+            <w:pPr>
+              <w:rPr>
+                <w:rFonts w:ascii="Times New Roman" w:eastAsia="Times New Roman" w:hAnsi="Times New Roman" w:cs="Times New Roman"/>
+                <w:sz w:val="24"/>
+                <w:szCs w:val="24"/>
+              </w:rPr>
+            </w:pPr>
+            <w:proofErr w:type="spellStart"/>
+            <w:r>
+              <w:rPr>
+                <w:rFonts w:ascii="Courier New" w:eastAsia="Times New Roman" w:hAnsi="Courier New" w:cs="Courier New"/>
+                <w:sz w:val="20"/>
+                <w:szCs w:val="20"/>
+              </w:rPr>
+              <w:t>makemigrations</w:t>
+            </w:r>
+            <w:proofErr w:type="spellEnd"/>
+          </w:p>
+        </w:tc>
+        <w:tc>
+          <w:tcPr>
+            <w:tcW w:w="0" w:type="auto"/>
+            <w:hideMark/>
+          </w:tcPr>
+          <w:p>
+            <w:pPr>
               <w:cnfStyle w:val="000000000000" w:firstRow="0" w:lastRow="0" w:firstColumn="0" w:lastColumn="0" w:oddVBand="0" w:evenVBand="0" w:oddHBand="0" w:evenHBand="0" w:firstRowFirstColumn="0" w:firstRowLastColumn="0" w:lastRowFirstColumn="0" w:lastRowLastColumn="0"/>
               <w:rPr>
                 <w:rFonts w:ascii="Times New Roman" w:eastAsia="Times New Roman" w:hAnsi="Times New Roman" w:cs="Times New Roman"/>
@@ -1836,7 +2130,7 @@
                 <w:szCs w:val="24"/>
                 <w:lang w:val="es-AR"/>
               </w:rPr>
-              <w:t>Define una ruta en el enrutador de Django</w:t>
+              <w:t>Crea los archivos de migración a partir de cambios en los modelos</w:t>
             </w:r>
           </w:p>
         </w:tc>
@@ -1870,15 +2164,7 @@
                 <w:sz w:val="24"/>
                 <w:szCs w:val="24"/>
               </w:rPr>
-              <w:t xml:space="preserve"> </w:t>
-            </w:r>
-            <w:r>
-              <w:rPr>
-                <w:rFonts w:ascii="Courier New" w:eastAsia="Times New Roman" w:hAnsi="Courier New" w:cs="Courier New"/>
-                <w:sz w:val="20"/>
-                <w:szCs w:val="20"/>
-              </w:rPr>
-              <w:t>urls.py</w:t>
+              <w:t xml:space="preserve"> la terminal</w:t>
             </w:r>
           </w:p>
         </w:tc>
@@ -1902,26 +2188,242 @@
                 <w:sz w:val="20"/>
                 <w:szCs w:val="20"/>
               </w:rPr>
-              <w:t xml:space="preserve">path('admin/', </w:t>
-            </w:r>
-            <w:proofErr w:type="spellStart"/>
-            <w:r>
-              <w:rPr>
-                <w:rFonts w:ascii="Courier New" w:eastAsia="Times New Roman" w:hAnsi="Courier New" w:cs="Courier New"/>
-                <w:sz w:val="20"/>
-                <w:szCs w:val="20"/>
-              </w:rPr>
-              <w:t>admin.site.urls</w:t>
-            </w:r>
-            <w:proofErr w:type="spellEnd"/>
-            <w:r>
-              <w:rPr>
-                <w:rFonts w:ascii="Courier New" w:eastAsia="Times New Roman" w:hAnsi="Courier New" w:cs="Courier New"/>
-                <w:sz w:val="20"/>
-                <w:szCs w:val="20"/>
-              </w:rPr>
-              <w:t>)</w:t>
-            </w:r>
+              <w:t xml:space="preserve">python manage.py </w:t>
+            </w:r>
+            <w:proofErr w:type="spellStart"/>
+            <w:r>
+              <w:rPr>
+                <w:rFonts w:ascii="Courier New" w:eastAsia="Times New Roman" w:hAnsi="Courier New" w:cs="Courier New"/>
+                <w:sz w:val="20"/>
+                <w:szCs w:val="20"/>
+              </w:rPr>
+              <w:t>makemigrations</w:t>
+            </w:r>
+            <w:proofErr w:type="spellEnd"/>
+          </w:p>
+        </w:tc>
+      </w:tr>
+      <w:tr>
+        <w:trPr>
+          <w:cnfStyle w:val="000000100000" w:firstRow="0" w:lastRow="0" w:firstColumn="0" w:lastColumn="0" w:oddVBand="0" w:evenVBand="0" w:oddHBand="1" w:evenHBand="0" w:firstRowFirstColumn="0" w:firstRowLastColumn="0" w:lastRowFirstColumn="0" w:lastRowLastColumn="0"/>
+        </w:trPr>
+        <w:tc>
+          <w:tcPr>
+            <w:cnfStyle w:val="001000000000" w:firstRow="0" w:lastRow="0" w:firstColumn="1" w:lastColumn="0" w:oddVBand="0" w:evenVBand="0" w:oddHBand="0" w:evenHBand="0" w:firstRowFirstColumn="0" w:firstRowLastColumn="0" w:lastRowFirstColumn="0" w:lastRowLastColumn="0"/>
+            <w:tcW w:w="0" w:type="auto"/>
+            <w:hideMark/>
+          </w:tcPr>
+          <w:p>
+            <w:pPr>
+              <w:rPr>
+                <w:rFonts w:ascii="Times New Roman" w:eastAsia="Times New Roman" w:hAnsi="Times New Roman" w:cs="Times New Roman"/>
+                <w:sz w:val="24"/>
+                <w:szCs w:val="24"/>
+              </w:rPr>
+            </w:pPr>
+            <w:proofErr w:type="spellStart"/>
+            <w:r>
+              <w:rPr>
+                <w:rFonts w:ascii="Courier New" w:eastAsia="Times New Roman" w:hAnsi="Courier New" w:cs="Courier New"/>
+                <w:sz w:val="20"/>
+                <w:szCs w:val="20"/>
+              </w:rPr>
+              <w:t>models.Model</w:t>
+            </w:r>
+            <w:proofErr w:type="spellEnd"/>
+          </w:p>
+        </w:tc>
+        <w:tc>
+          <w:tcPr>
+            <w:tcW w:w="0" w:type="auto"/>
+            <w:hideMark/>
+          </w:tcPr>
+          <w:p>
+            <w:pPr>
+              <w:cnfStyle w:val="000000100000" w:firstRow="0" w:lastRow="0" w:firstColumn="0" w:lastColumn="0" w:oddVBand="0" w:evenVBand="0" w:oddHBand="1" w:evenHBand="0" w:firstRowFirstColumn="0" w:firstRowLastColumn="0" w:lastRowFirstColumn="0" w:lastRowLastColumn="0"/>
+              <w:rPr>
+                <w:rFonts w:ascii="Times New Roman" w:eastAsia="Times New Roman" w:hAnsi="Times New Roman" w:cs="Times New Roman"/>
+                <w:sz w:val="24"/>
+                <w:szCs w:val="24"/>
+                <w:lang w:val="es-AR"/>
+              </w:rPr>
+            </w:pPr>
+            <w:r>
+              <w:rPr>
+                <w:rFonts w:ascii="Times New Roman" w:eastAsia="Times New Roman" w:hAnsi="Times New Roman" w:cs="Times New Roman"/>
+                <w:sz w:val="24"/>
+                <w:szCs w:val="24"/>
+                <w:lang w:val="es-AR"/>
+              </w:rPr>
+              <w:t>Clase base para definir tablas de la base de datos</w:t>
+            </w:r>
+          </w:p>
+        </w:tc>
+        <w:tc>
+          <w:tcPr>
+            <w:tcW w:w="0" w:type="auto"/>
+            <w:hideMark/>
+          </w:tcPr>
+          <w:p>
+            <w:pPr>
+              <w:cnfStyle w:val="000000100000" w:firstRow="0" w:lastRow="0" w:firstColumn="0" w:lastColumn="0" w:oddVBand="0" w:evenVBand="0" w:oddHBand="1" w:evenHBand="0" w:firstRowFirstColumn="0" w:firstRowLastColumn="0" w:lastRowFirstColumn="0" w:lastRowLastColumn="0"/>
+              <w:rPr>
+                <w:rFonts w:ascii="Times New Roman" w:eastAsia="Times New Roman" w:hAnsi="Times New Roman" w:cs="Times New Roman"/>
+                <w:sz w:val="24"/>
+                <w:szCs w:val="24"/>
+                <w:lang w:val="es-AR"/>
+              </w:rPr>
+            </w:pPr>
+            <w:r>
+              <w:rPr>
+                <w:rFonts w:ascii="Times New Roman" w:eastAsia="Times New Roman" w:hAnsi="Times New Roman" w:cs="Times New Roman"/>
+                <w:sz w:val="24"/>
+                <w:szCs w:val="24"/>
+                <w:lang w:val="es-AR"/>
+              </w:rPr>
+              <w:t xml:space="preserve">En </w:t>
+            </w:r>
+            <w:r>
+              <w:rPr>
+                <w:rFonts w:ascii="Courier New" w:eastAsia="Times New Roman" w:hAnsi="Courier New" w:cs="Courier New"/>
+                <w:sz w:val="20"/>
+                <w:szCs w:val="20"/>
+                <w:lang w:val="es-AR"/>
+              </w:rPr>
+              <w:t>models.py</w:t>
+            </w:r>
+            <w:r>
+              <w:rPr>
+                <w:rFonts w:ascii="Times New Roman" w:eastAsia="Times New Roman" w:hAnsi="Times New Roman" w:cs="Times New Roman"/>
+                <w:sz w:val="24"/>
+                <w:szCs w:val="24"/>
+                <w:lang w:val="es-AR"/>
+              </w:rPr>
+              <w:t xml:space="preserve"> de cada app</w:t>
+            </w:r>
+          </w:p>
+        </w:tc>
+        <w:tc>
+          <w:tcPr>
+            <w:tcW w:w="0" w:type="auto"/>
+            <w:hideMark/>
+          </w:tcPr>
+          <w:p>
+            <w:pPr>
+              <w:cnfStyle w:val="000000100000" w:firstRow="0" w:lastRow="0" w:firstColumn="0" w:lastColumn="0" w:oddVBand="0" w:evenVBand="0" w:oddHBand="1" w:evenHBand="0" w:firstRowFirstColumn="0" w:firstRowLastColumn="0" w:lastRowFirstColumn="0" w:lastRowLastColumn="0"/>
+              <w:rPr>
+                <w:rFonts w:ascii="Times New Roman" w:eastAsia="Times New Roman" w:hAnsi="Times New Roman" w:cs="Times New Roman"/>
+                <w:sz w:val="24"/>
+                <w:szCs w:val="24"/>
+              </w:rPr>
+            </w:pPr>
+            <w:r>
+              <w:rPr>
+                <w:rFonts w:ascii="Courier New" w:eastAsia="Times New Roman" w:hAnsi="Courier New" w:cs="Courier New"/>
+                <w:sz w:val="20"/>
+                <w:szCs w:val="20"/>
+              </w:rPr>
+              <w:t xml:space="preserve">class </w:t>
+            </w:r>
+            <w:proofErr w:type="spellStart"/>
+            <w:r>
+              <w:rPr>
+                <w:rFonts w:ascii="Courier New" w:eastAsia="Times New Roman" w:hAnsi="Courier New" w:cs="Courier New"/>
+                <w:sz w:val="20"/>
+                <w:szCs w:val="20"/>
+              </w:rPr>
+              <w:t>Producto</w:t>
+            </w:r>
+            <w:proofErr w:type="spellEnd"/>
+            <w:r>
+              <w:rPr>
+                <w:rFonts w:ascii="Courier New" w:eastAsia="Times New Roman" w:hAnsi="Courier New" w:cs="Courier New"/>
+                <w:sz w:val="20"/>
+                <w:szCs w:val="20"/>
+              </w:rPr>
+              <w:t>(</w:t>
+            </w:r>
+            <w:proofErr w:type="spellStart"/>
+            <w:r>
+              <w:rPr>
+                <w:rFonts w:ascii="Courier New" w:eastAsia="Times New Roman" w:hAnsi="Courier New" w:cs="Courier New"/>
+                <w:sz w:val="20"/>
+                <w:szCs w:val="20"/>
+              </w:rPr>
+              <w:t>models.Model</w:t>
+            </w:r>
+            <w:proofErr w:type="spellEnd"/>
+            <w:r>
+              <w:rPr>
+                <w:rFonts w:ascii="Courier New" w:eastAsia="Times New Roman" w:hAnsi="Courier New" w:cs="Courier New"/>
+                <w:sz w:val="20"/>
+                <w:szCs w:val="20"/>
+              </w:rPr>
+              <w:t>):</w:t>
+            </w:r>
+          </w:p>
+        </w:tc>
+      </w:tr>
+      <w:tr>
+        <w:tc>
+          <w:tcPr>
+            <w:cnfStyle w:val="001000000000" w:firstRow="0" w:lastRow="0" w:firstColumn="1" w:lastColumn="0" w:oddVBand="0" w:evenVBand="0" w:oddHBand="0" w:evenHBand="0" w:firstRowFirstColumn="0" w:firstRowLastColumn="0" w:lastRowFirstColumn="0" w:lastRowLastColumn="0"/>
+            <w:tcW w:w="0" w:type="auto"/>
+          </w:tcPr>
+          <w:p>
+            <w:pPr>
+              <w:rPr>
+                <w:rFonts w:ascii="Times New Roman" w:eastAsia="Times New Roman" w:hAnsi="Times New Roman" w:cs="Times New Roman"/>
+                <w:sz w:val="24"/>
+                <w:szCs w:val="24"/>
+              </w:rPr>
+            </w:pPr>
+          </w:p>
+        </w:tc>
+        <w:tc>
+          <w:tcPr>
+            <w:tcW w:w="0" w:type="auto"/>
+          </w:tcPr>
+          <w:p>
+            <w:pPr>
+              <w:cnfStyle w:val="000000000000" w:firstRow="0" w:lastRow="0" w:firstColumn="0" w:lastColumn="0" w:oddVBand="0" w:evenVBand="0" w:oddHBand="0" w:evenHBand="0" w:firstRowFirstColumn="0" w:firstRowLastColumn="0" w:lastRowFirstColumn="0" w:lastRowLastColumn="0"/>
+              <w:rPr>
+                <w:rFonts w:ascii="Times New Roman" w:eastAsia="Times New Roman" w:hAnsi="Times New Roman" w:cs="Times New Roman"/>
+                <w:sz w:val="24"/>
+                <w:szCs w:val="24"/>
+                <w:lang w:val="es-AR"/>
+              </w:rPr>
+            </w:pPr>
+          </w:p>
+        </w:tc>
+        <w:tc>
+          <w:tcPr>
+            <w:tcW w:w="0" w:type="auto"/>
+          </w:tcPr>
+          <w:p>
+            <w:pPr>
+              <w:cnfStyle w:val="000000000000" w:firstRow="0" w:lastRow="0" w:firstColumn="0" w:lastColumn="0" w:oddVBand="0" w:evenVBand="0" w:oddHBand="0" w:evenHBand="0" w:firstRowFirstColumn="0" w:firstRowLastColumn="0" w:lastRowFirstColumn="0" w:lastRowLastColumn="0"/>
+              <w:rPr>
+                <w:rFonts w:ascii="Times New Roman" w:eastAsia="Times New Roman" w:hAnsi="Times New Roman" w:cs="Times New Roman"/>
+                <w:sz w:val="24"/>
+                <w:szCs w:val="24"/>
+              </w:rPr>
+            </w:pPr>
+          </w:p>
+        </w:tc>
+        <w:tc>
+          <w:tcPr>
+            <w:tcW w:w="0" w:type="auto"/>
+          </w:tcPr>
+          <w:p>
+            <w:pPr>
+              <w:cnfStyle w:val="000000000000" w:firstRow="0" w:lastRow="0" w:firstColumn="0" w:lastColumn="0" w:oddVBand="0" w:evenVBand="0" w:oddHBand="0" w:evenHBand="0" w:firstRowFirstColumn="0" w:firstRowLastColumn="0" w:lastRowFirstColumn="0" w:lastRowLastColumn="0"/>
+              <w:rPr>
+                <w:rFonts w:ascii="Times New Roman" w:eastAsia="Times New Roman" w:hAnsi="Times New Roman" w:cs="Times New Roman"/>
+                <w:sz w:val="24"/>
+                <w:szCs w:val="24"/>
+              </w:rPr>
+            </w:pPr>
           </w:p>
         </w:tc>
       </w:tr>
@@ -3564,7 +4066,7 @@
 </file>
 
 <file path=customXml/itemProps1.xml><?xml version="1.0" encoding="utf-8"?>
-<ds:datastoreItem xmlns:ds="http://schemas.openxmlformats.org/officeDocument/2006/customXml" ds:itemID="{4A4C08C5-3026-4F9A-A378-B09838230812}">
+<ds:datastoreItem xmlns:ds="http://schemas.openxmlformats.org/officeDocument/2006/customXml" ds:itemID="{A2EEFB80-D18C-4DE8-AA17-561A32EC1B51}">
   <ds:schemaRefs>
     <ds:schemaRef ds:uri="http://schemas.openxmlformats.org/officeDocument/2006/bibliography"/>
   </ds:schemaRefs>

</xml_diff>